<commit_message>
Quote form sends directly; footer globe counter
</commit_message>
<xml_diff>
--- a/Sales/ColdCheck-Sales-Playbook.docx
+++ b/Sales/ColdCheck-Sales-Playbook.docx
@@ -12,6 +12,7 @@
     </w:p>
     <w:p>
       <w:pPr>
+        <w:keepNext w:val="false"/>
         <w:spacing w:after="140"/>
       </w:pPr>
       <w:r>
@@ -19,7 +20,7 @@
           <w:i/>
           <w:iCs/>
         </w:rPr>
-        <w:t xml:space="preserve">COOKd Kitchen. Prepared September 25, 2026. For sales representatives.</w:t>
+        <w:t xml:space="preserve">COOKd Kitchen. Updated September 25, 2026. For sales representatives.</w:t>
       </w:r>
     </w:p>
     <w:p>
@@ -32,6 +33,7 @@
     </w:p>
     <w:p>
       <w:pPr>
+        <w:keepNext w:val="false"/>
         <w:spacing w:after="140"/>
       </w:pPr>
       <w:r>
@@ -40,10 +42,11 @@
     </w:p>
     <w:p>
       <w:pPr>
+        <w:keepNext/>
         <w:spacing w:after="140"/>
       </w:pPr>
       <w:r>
-        <w:t xml:space="preserve">The customer buys the equipment once and owns it, then pays a monthly plan for 24/7 monitoring, alerts, logs, and support. Every price below is on the website's quote calculator, so what you say always matches what they see.</w:t>
+        <w:t xml:space="preserve">The customer buys the equipment once and owns it, then pays a monthly plan for 24/7 monitoring, alerts, logs, and support. The kit ships preconfigured and registered to their account, and the owner sets it up themselves in their own kitchen. There are no in-person visits. Every price below is on the website's quote calculator, so what you say always matches what they see.</w:t>
       </w:r>
     </w:p>
     <w:tbl>
@@ -59,8 +62,8 @@
         </w:tblBorders>
       </w:tblPr>
       <w:tblGrid>
-        <w:gridCol w:w="5857"/>
-        <w:gridCol w:w="4223"/>
+        <w:gridCol w:w="6646"/>
+        <w:gridCol w:w="3434"/>
       </w:tblGrid>
       <w:tr>
         <w:trPr>
@@ -69,7 +72,7 @@
         </w:trPr>
         <w:tc>
           <w:tcPr>
-            <w:tcW w:type="dxa" w:w="5857"/>
+            <w:tcW w:type="dxa" w:w="6646"/>
             <w:tcBorders>
               <w:top w:val="single" w:color="B8C8D8" w:sz="4"/>
               <w:left w:val="single" w:color="B8C8D8" w:sz="4"/>
@@ -99,7 +102,7 @@
         </w:tc>
         <w:tc>
           <w:tcPr>
-            <w:tcW w:type="dxa" w:w="4223"/>
+            <w:tcW w:type="dxa" w:w="3434"/>
             <w:tcBorders>
               <w:top w:val="single" w:color="B8C8D8" w:sz="4"/>
               <w:left w:val="single" w:color="B8C8D8" w:sz="4"/>
@@ -135,7 +138,7 @@
         </w:trPr>
         <w:tc>
           <w:tcPr>
-            <w:tcW w:type="dxa" w:w="5857"/>
+            <w:tcW w:type="dxa" w:w="6646"/>
             <w:tcBorders>
               <w:top w:val="single" w:color="B8C8D8" w:sz="4"/>
               <w:left w:val="single" w:color="B8C8D8" w:sz="4"/>
@@ -161,27 +164,27 @@
         </w:tc>
         <w:tc>
           <w:tcPr>
-            <w:tcW w:type="dxa" w:w="4223"/>
-            <w:tcBorders>
-              <w:top w:val="single" w:color="B8C8D8" w:sz="4"/>
-              <w:left w:val="single" w:color="B8C8D8" w:sz="4"/>
-              <w:bottom w:val="single" w:color="B8C8D8" w:sz="4"/>
-              <w:right w:val="single" w:color="B8C8D8" w:sz="4"/>
-            </w:tcBorders>
-            <w:tcMar>
-              <w:top w:type="dxa" w:w="60"/>
-              <w:left w:type="dxa" w:w="90"/>
-              <w:bottom w:type="dxa" w:w="60"/>
-              <w:right w:type="dxa" w:w="90"/>
-            </w:tcMar>
-          </w:tcPr>
-          <w:p>
-            <w:r>
-              <w:rPr>
-                <w:sz w:val="18"/>
-                <w:szCs w:val="18"/>
-              </w:rPr>
-              <w:t xml:space="preserve">$249</w:t>
+            <w:tcW w:type="dxa" w:w="3434"/>
+            <w:tcBorders>
+              <w:top w:val="single" w:color="B8C8D8" w:sz="4"/>
+              <w:left w:val="single" w:color="B8C8D8" w:sz="4"/>
+              <w:bottom w:val="single" w:color="B8C8D8" w:sz="4"/>
+              <w:right w:val="single" w:color="B8C8D8" w:sz="4"/>
+            </w:tcBorders>
+            <w:tcMar>
+              <w:top w:type="dxa" w:w="60"/>
+              <w:left w:type="dxa" w:w="90"/>
+              <w:bottom w:type="dxa" w:w="60"/>
+              <w:right w:type="dxa" w:w="90"/>
+            </w:tcMar>
+          </w:tcPr>
+          <w:p>
+            <w:r>
+              <w:rPr>
+                <w:sz w:val="18"/>
+                <w:szCs w:val="18"/>
+              </w:rPr>
+              <w:t xml:space="preserve">$299</w:t>
             </w:r>
           </w:p>
         </w:tc>
@@ -193,7 +196,7 @@
         </w:trPr>
         <w:tc>
           <w:tcPr>
-            <w:tcW w:type="dxa" w:w="5857"/>
+            <w:tcW w:type="dxa" w:w="6646"/>
             <w:tcBorders>
               <w:top w:val="single" w:color="B8C8D8" w:sz="4"/>
               <w:left w:val="single" w:color="B8C8D8" w:sz="4"/>
@@ -219,7 +222,7 @@
         </w:tc>
         <w:tc>
           <w:tcPr>
-            <w:tcW w:type="dxa" w:w="4223"/>
+            <w:tcW w:type="dxa" w:w="3434"/>
             <w:tcBorders>
               <w:top w:val="single" w:color="B8C8D8" w:sz="4"/>
               <w:left w:val="single" w:color="B8C8D8" w:sz="4"/>
@@ -251,7 +254,7 @@
         </w:trPr>
         <w:tc>
           <w:tcPr>
-            <w:tcW w:type="dxa" w:w="5857"/>
+            <w:tcW w:type="dxa" w:w="6646"/>
             <w:tcBorders>
               <w:top w:val="single" w:color="B8C8D8" w:sz="4"/>
               <w:left w:val="single" w:color="B8C8D8" w:sz="4"/>
@@ -277,27 +280,27 @@
         </w:tc>
         <w:tc>
           <w:tcPr>
-            <w:tcW w:type="dxa" w:w="4223"/>
-            <w:tcBorders>
-              <w:top w:val="single" w:color="B8C8D8" w:sz="4"/>
-              <w:left w:val="single" w:color="B8C8D8" w:sz="4"/>
-              <w:bottom w:val="single" w:color="B8C8D8" w:sz="4"/>
-              <w:right w:val="single" w:color="B8C8D8" w:sz="4"/>
-            </w:tcBorders>
-            <w:tcMar>
-              <w:top w:type="dxa" w:w="60"/>
-              <w:left w:type="dxa" w:w="90"/>
-              <w:bottom w:type="dxa" w:w="60"/>
-              <w:right w:type="dxa" w:w="90"/>
-            </w:tcMar>
-          </w:tcPr>
-          <w:p>
-            <w:r>
-              <w:rPr>
-                <w:sz w:val="18"/>
-                <w:szCs w:val="18"/>
-              </w:rPr>
-              <w:t xml:space="preserve">$179 each</w:t>
+            <w:tcW w:type="dxa" w:w="3434"/>
+            <w:tcBorders>
+              <w:top w:val="single" w:color="B8C8D8" w:sz="4"/>
+              <w:left w:val="single" w:color="B8C8D8" w:sz="4"/>
+              <w:bottom w:val="single" w:color="B8C8D8" w:sz="4"/>
+              <w:right w:val="single" w:color="B8C8D8" w:sz="4"/>
+            </w:tcBorders>
+            <w:tcMar>
+              <w:top w:type="dxa" w:w="60"/>
+              <w:left w:type="dxa" w:w="90"/>
+              <w:bottom w:type="dxa" w:w="60"/>
+              <w:right w:type="dxa" w:w="90"/>
+            </w:tcMar>
+          </w:tcPr>
+          <w:p>
+            <w:r>
+              <w:rPr>
+                <w:sz w:val="18"/>
+                <w:szCs w:val="18"/>
+              </w:rPr>
+              <w:t xml:space="preserve">$199 each</w:t>
             </w:r>
           </w:p>
         </w:tc>
@@ -309,53 +312,53 @@
         </w:trPr>
         <w:tc>
           <w:tcPr>
-            <w:tcW w:type="dxa" w:w="5857"/>
-            <w:tcBorders>
-              <w:top w:val="single" w:color="B8C8D8" w:sz="4"/>
-              <w:left w:val="single" w:color="B8C8D8" w:sz="4"/>
-              <w:bottom w:val="single" w:color="B8C8D8" w:sz="4"/>
-              <w:right w:val="single" w:color="B8C8D8" w:sz="4"/>
-            </w:tcBorders>
-            <w:tcMar>
-              <w:top w:type="dxa" w:w="60"/>
-              <w:left w:type="dxa" w:w="90"/>
-              <w:bottom w:type="dxa" w:w="60"/>
-              <w:right w:type="dxa" w:w="90"/>
-            </w:tcMar>
-          </w:tcPr>
-          <w:p>
-            <w:r>
-              <w:rPr>
-                <w:sz w:val="18"/>
-                <w:szCs w:val="18"/>
-              </w:rPr>
-              <w:t xml:space="preserve">Professional installation and setup</w:t>
-            </w:r>
-          </w:p>
-        </w:tc>
-        <w:tc>
-          <w:tcPr>
-            <w:tcW w:type="dxa" w:w="4223"/>
-            <w:tcBorders>
-              <w:top w:val="single" w:color="B8C8D8" w:sz="4"/>
-              <w:left w:val="single" w:color="B8C8D8" w:sz="4"/>
-              <w:bottom w:val="single" w:color="B8C8D8" w:sz="4"/>
-              <w:right w:val="single" w:color="B8C8D8" w:sz="4"/>
-            </w:tcBorders>
-            <w:tcMar>
-              <w:top w:type="dxa" w:w="60"/>
-              <w:left w:type="dxa" w:w="90"/>
-              <w:bottom w:type="dxa" w:w="60"/>
-              <w:right w:type="dxa" w:w="90"/>
-            </w:tcMar>
-          </w:tcPr>
-          <w:p>
-            <w:r>
-              <w:rPr>
-                <w:sz w:val="18"/>
-                <w:szCs w:val="18"/>
-              </w:rPr>
-              <w:t xml:space="preserve">$199</w:t>
+            <w:tcW w:type="dxa" w:w="6646"/>
+            <w:tcBorders>
+              <w:top w:val="single" w:color="B8C8D8" w:sz="4"/>
+              <w:left w:val="single" w:color="B8C8D8" w:sz="4"/>
+              <w:bottom w:val="single" w:color="B8C8D8" w:sz="4"/>
+              <w:right w:val="single" w:color="B8C8D8" w:sz="4"/>
+            </w:tcBorders>
+            <w:tcMar>
+              <w:top w:type="dxa" w:w="60"/>
+              <w:left w:type="dxa" w:w="90"/>
+              <w:bottom w:type="dxa" w:w="60"/>
+              <w:right w:type="dxa" w:w="90"/>
+            </w:tcMar>
+          </w:tcPr>
+          <w:p>
+            <w:r>
+              <w:rPr>
+                <w:sz w:val="18"/>
+                <w:szCs w:val="18"/>
+              </w:rPr>
+              <w:t xml:space="preserve">Setup and activation (preconfigured, shipped, remote setup call)</w:t>
+            </w:r>
+          </w:p>
+        </w:tc>
+        <w:tc>
+          <w:tcPr>
+            <w:tcW w:type="dxa" w:w="3434"/>
+            <w:tcBorders>
+              <w:top w:val="single" w:color="B8C8D8" w:sz="4"/>
+              <w:left w:val="single" w:color="B8C8D8" w:sz="4"/>
+              <w:bottom w:val="single" w:color="B8C8D8" w:sz="4"/>
+              <w:right w:val="single" w:color="B8C8D8" w:sz="4"/>
+            </w:tcBorders>
+            <w:tcMar>
+              <w:top w:type="dxa" w:w="60"/>
+              <w:left w:type="dxa" w:w="90"/>
+              <w:bottom w:type="dxa" w:w="60"/>
+              <w:right w:type="dxa" w:w="90"/>
+            </w:tcMar>
+          </w:tcPr>
+          <w:p>
+            <w:r>
+              <w:rPr>
+                <w:sz w:val="18"/>
+                <w:szCs w:val="18"/>
+              </w:rPr>
+              <w:t xml:space="preserve">$99</w:t>
             </w:r>
           </w:p>
         </w:tc>
@@ -367,7 +370,7 @@
         </w:trPr>
         <w:tc>
           <w:tcPr>
-            <w:tcW w:type="dxa" w:w="5857"/>
+            <w:tcW w:type="dxa" w:w="6646"/>
             <w:tcBorders>
               <w:top w:val="single" w:color="B8C8D8" w:sz="4"/>
               <w:left w:val="single" w:color="B8C8D8" w:sz="4"/>
@@ -393,7 +396,7 @@
         </w:tc>
         <w:tc>
           <w:tcPr>
-            <w:tcW w:type="dxa" w:w="4223"/>
+            <w:tcW w:type="dxa" w:w="3434"/>
             <w:tcBorders>
               <w:top w:val="single" w:color="B8C8D8" w:sz="4"/>
               <w:left w:val="single" w:color="B8C8D8" w:sz="4"/>
@@ -425,7 +428,7 @@
         </w:trPr>
         <w:tc>
           <w:tcPr>
-            <w:tcW w:type="dxa" w:w="5857"/>
+            <w:tcW w:type="dxa" w:w="6646"/>
             <w:tcBorders>
               <w:top w:val="single" w:color="B8C8D8" w:sz="4"/>
               <w:left w:val="single" w:color="B8C8D8" w:sz="4"/>
@@ -451,7 +454,7 @@
         </w:tc>
         <w:tc>
           <w:tcPr>
-            <w:tcW w:type="dxa" w:w="4223"/>
+            <w:tcW w:type="dxa" w:w="3434"/>
             <w:tcBorders>
               <w:top w:val="single" w:color="B8C8D8" w:sz="4"/>
               <w:left w:val="single" w:color="B8C8D8" w:sz="4"/>
@@ -484,6 +487,7 @@
     </w:p>
     <w:p>
       <w:pPr>
+        <w:keepNext w:val="false"/>
         <w:spacing w:after="140"/>
       </w:pPr>
       <w:r>
@@ -494,7 +498,7 @@
           <w:b/>
           <w:bCs/>
         </w:rPr>
-        <w:t xml:space="preserve">$1,343 up front</w:t>
+        <w:t xml:space="preserve">$1,393 up front</w:t>
       </w:r>
       <w:r>
         <w:t xml:space="preserve"> and </w:t>
@@ -512,6 +516,7 @@
     </w:p>
     <w:p>
       <w:pPr>
+        <w:keepNext w:val="false"/>
         <w:spacing w:after="140"/>
       </w:pPr>
       <w:r>
@@ -527,6 +532,7 @@
     </w:p>
     <w:p>
       <w:pPr>
+        <w:keepNext w:val="false"/>
         <w:spacing w:after="140"/>
       </w:pPr>
       <w:r>
@@ -534,10 +540,10 @@
           <w:b/>
           <w:bCs/>
         </w:rPr>
-        <w:t xml:space="preserve">Your goal on the first call</w:t>
-      </w:r>
-      <w:r>
-        <w:t xml:space="preserve"> is not to sell. It is to book a 15-minute visit where our local specialist shows the live demo and builds their exact quote on the spot.</w:t>
+        <w:t xml:space="preserve">How a sale happens:</w:t>
+      </w:r>
+      <w:r>
+        <w:t xml:space="preserve"> you call, get the owner to look at the live demo on their phone, build their quote together, and send it. When they approve it, COOKd Kitchen sends a secure payment link. The kit ships once payment clears. You are paid only on sales that are paid for.</w:t>
       </w:r>
     </w:p>
     <w:p>
@@ -550,14 +556,16 @@
     </w:p>
     <w:p>
       <w:pPr>
+        <w:keepNext w:val="false"/>
         <w:spacing w:after="140"/>
       </w:pPr>
       <w:r>
-        <w:t xml:space="preserve">Every call follows the same path: reach the owner or manager, ask the 2 a.m. question, give a 30-second pitch, and book the visit. Our local specialist handles the visit, the quote, and the install.</w:t>
+        <w:t xml:space="preserve">Every call follows the same path: reach the owner or manager, ask the 2 a.m. question, give a 30-second pitch, show the live demo, and send their quote.</w:t>
       </w:r>
     </w:p>
     <w:p>
       <w:pPr>
+        <w:keepNext/>
         <w:spacing w:after="140"/>
       </w:pPr>
       <w:r>
@@ -586,6 +594,7 @@
     </w:p>
     <w:p>
       <w:pPr>
+        <w:keepNext/>
         <w:spacing w:after="140"/>
       </w:pPr>
       <w:r>
@@ -617,6 +626,7 @@
     </w:p>
     <w:p>
       <w:pPr>
+        <w:keepNext/>
         <w:spacing w:after="140"/>
       </w:pPr>
       <w:r>
@@ -641,6 +651,7 @@
     </w:p>
     <w:p>
       <w:pPr>
+        <w:keepNext/>
         <w:spacing w:after="140"/>
       </w:pPr>
       <w:r>
@@ -667,11 +678,12 @@
           <w:i/>
           <w:iCs/>
         </w:rPr>
-        <w:t xml:space="preserve">"That's exactly what we fix. We put small wireless sensors in your coolers and freezers. If anything starts warming up, day or night, you get a text right away, while there's still time to save the food. It also keeps your temperature logs automatically, so there's no clipboard, and you can pull them up for an inspector on your phone. We call it Night Shift, because it watches your kitchen when nobody's there."</w:t>
+        <w:t xml:space="preserve">"That's exactly what we fix. We send you small wireless sensors for your coolers and freezers. If anything starts warming up, day or night, you get a text right away, while there's still time to save the food. It also keeps your temperature logs automatically, so there's no clipboard, and you can pull them up for an inspector on your phone. We call it Night Shift, because it watches your kitchen when nobody's there."</w:t>
       </w:r>
     </w:p>
     <w:p>
       <w:pPr>
+        <w:keepNext/>
         <w:spacing w:after="140"/>
       </w:pPr>
       <w:r>
@@ -679,10 +691,10 @@
           <w:b/>
           <w:bCs/>
         </w:rPr>
-        <w:t xml:space="preserve">4. Book the visit.</w:t>
-      </w:r>
-      <w:r>
-        <w:t xml:space="preserve"> Offer two choices, not a yes-or-no.</w:t>
+        <w:t xml:space="preserve">4. Show the live demo.</w:t>
+      </w:r>
+      <w:r>
+        <w:t xml:space="preserve"> Get it on their screen while you're on the phone.</w:t>
       </w:r>
     </w:p>
     <w:p>
@@ -698,11 +710,12 @@
           <w:i/>
           <w:iCs/>
         </w:rPr>
-        <w:t xml:space="preserve">"Our local specialist can stop by and show you how it works. It takes 15 minutes, and you'll get an exact price for your kitchen on the spot. Would tomorrow or Thursday afternoon work better?"</w:t>
+        <w:t xml:space="preserve">"Can I text you a link? It's a live demo. Tap the red button that says Simulate 3 a.m. failure and watch what happens. That alert is exactly what your phone would get."</w:t>
       </w:r>
     </w:p>
     <w:p>
       <w:pPr>
+        <w:keepNext/>
         <w:spacing w:after="140"/>
       </w:pPr>
       <w:r>
@@ -710,7 +723,7 @@
           <w:b/>
           <w:bCs/>
         </w:rPr>
-        <w:t xml:space="preserve">5. If they ask about price, be straight.</w:t>
+        <w:t xml:space="preserve">5. Build the quote together.</w:t>
       </w:r>
     </w:p>
     <w:p>
@@ -726,11 +739,12 @@
           <w:i/>
           <w:iCs/>
         </w:rPr>
-        <w:t xml:space="preserve">"For most kitchens with about five coolers and freezers, it's around $1,300 one time for the equipment and installation, which you own, then about $99 a month for monitoring. The exact number depends on how many units you have, which is why our specialist likes to see the kitchen first. One walk-in failure can cost several thousand dollars in food, so for most owners it pays for itself the first time it catches something."</w:t>
+        <w:t xml:space="preserve">"How many coolers, freezers, reach-ins, and prep tables do you have? Great. For [number] units, it's [upfront total] one time for the equipment, which you own, then [monthly price] a month for monitoring. I can email you that quote right now so you can look it over."</w:t>
       </w:r>
     </w:p>
     <w:p>
       <w:pPr>
+        <w:keepNext/>
         <w:spacing w:after="140"/>
       </w:pPr>
       <w:r>
@@ -738,10 +752,74 @@
           <w:b/>
           <w:bCs/>
         </w:rPr>
-        <w:t xml:space="preserve">6. Qualifying questions</w:t>
-      </w:r>
-      <w:r>
-        <w:t xml:space="preserve"> (ask before booking the visit)</w:t>
+        <w:t xml:space="preserve">6. Explain setup.</w:t>
+      </w:r>
+      <w:r>
+        <w:t xml:space="preserve"> Owners worry it's complicated. It isn't.</w:t>
+      </w:r>
+    </w:p>
+    <w:p>
+      <w:pPr>
+        <w:pBdr>
+          <w:left w:val="single" w:color="1F6FA8" w:sz="18" w:space="8"/>
+        </w:pBdr>
+        <w:spacing w:after="160" w:before="60"/>
+        <w:ind w:left="360"/>
+      </w:pPr>
+      <w:r>
+        <w:rPr>
+          <w:i/>
+          <w:iCs/>
+        </w:rPr>
+        <w:t xml:space="preserve">"Everything arrives already set up for your account. You plug in one small box, stick each sensor next to its cooler door, and run a thin probe inside. Then you scan each sensor with your phone and name it. If you want help, we'll walk you through it on a call."</w:t>
+      </w:r>
+    </w:p>
+    <w:p>
+      <w:pPr>
+        <w:keepNext/>
+        <w:spacing w:after="140"/>
+      </w:pPr>
+      <w:r>
+        <w:rPr>
+          <w:b/>
+          <w:bCs/>
+        </w:rPr>
+        <w:t xml:space="preserve">7. Ask for the sale.</w:t>
+      </w:r>
+      <w:r>
+        <w:t xml:space="preserve"> Ask plainly, then be quiet.</w:t>
+      </w:r>
+    </w:p>
+    <w:p>
+      <w:pPr>
+        <w:pBdr>
+          <w:left w:val="single" w:color="1F6FA8" w:sz="18" w:space="8"/>
+        </w:pBdr>
+        <w:spacing w:after="160" w:before="60"/>
+        <w:ind w:left="360"/>
+      </w:pPr>
+      <w:r>
+        <w:rPr>
+          <w:i/>
+          <w:iCs/>
+        </w:rPr>
+        <w:t xml:space="preserve">"Does that sound like it would help your kitchen? If you're ready, I'll have a secure payment link sent to your email today, and your kit ships as soon as it goes through."</w:t>
+      </w:r>
+    </w:p>
+    <w:p>
+      <w:pPr>
+        <w:keepNext/>
+        <w:spacing w:after="140"/>
+      </w:pPr>
+      <w:r>
+        <w:rPr>
+          <w:b/>
+          <w:bCs/>
+        </w:rPr>
+        <w:t xml:space="preserve">Qualifying questions</w:t>
+      </w:r>
+      <w:r>
+        <w:t xml:space="preserve"> (ask these during the call)</w:t>
       </w:r>
     </w:p>
     <w:p>
@@ -811,6 +889,7 @@
     </w:p>
     <w:p>
       <w:pPr>
+        <w:keepNext/>
         <w:spacing w:after="140"/>
       </w:pPr>
       <w:r>
@@ -818,7 +897,7 @@
           <w:b/>
           <w:bCs/>
         </w:rPr>
-        <w:t xml:space="preserve">7. Voicemail</w:t>
+        <w:t xml:space="preserve">Voicemail</w:t>
       </w:r>
     </w:p>
     <w:p>
@@ -839,6 +918,7 @@
     </w:p>
     <w:p>
       <w:pPr>
+        <w:keepNext w:val="false"/>
         <w:spacing w:after="140"/>
       </w:pPr>
       <w:r>
@@ -849,7 +929,7 @@
         <w:t xml:space="preserve">For franchise and multi-location calls,</w:t>
       </w:r>
       <w:r>
-        <w:t xml:space="preserve"> ask for the owner, operations director, or facilities manager, and add: "We can set up every location at once, and you'd see all of them on one screen." Log how many locations they run; a 10-store group is worth 10 installs.</w:t>
+        <w:t xml:space="preserve"> ask for the owner, operations director, or facilities manager, and add: "We can ship kits for every location at once, and you'd see all of them on one screen." Log how many locations they run; a 10-store group is 10 sales.</w:t>
       </w:r>
     </w:p>
     <w:p>
@@ -862,10 +942,11 @@
     </w:p>
     <w:p>
       <w:pPr>
+        <w:keepNext/>
         <w:spacing w:after="140"/>
       </w:pPr>
       <w:r>
-        <w:t xml:space="preserve">Answer every objection honestly, then go back to booking the visit.</w:t>
+        <w:t xml:space="preserve">Answer every objection honestly, then go back to the demo or the quote.</w:t>
       </w:r>
     </w:p>
     <w:tbl>
@@ -1035,7 +1116,7 @@
                 <w:sz w:val="18"/>
                 <w:szCs w:val="18"/>
               </w:rPr>
-              <w:t xml:space="preserve">"We already check temperatures."</w:t>
+              <w:t xml:space="preserve">"I don't have time to install anything."</w:t>
             </w:r>
           </w:p>
         </w:tc>
@@ -1061,7 +1142,7 @@
                 <w:sz w:val="18"/>
                 <w:szCs w:val="18"/>
               </w:rPr>
-              <w:t xml:space="preserve">"That's great, it means you care about this. The problem is the hours nobody's there: overnight and days you're closed. That's when coolers fail and nobody notices. And it writes the logs for you, so your staff gets that time back."</w:t>
+              <w:t xml:space="preserve">"It arrives already set up for your account. Most of the work is sticking sensors next to your cooler doors and plugging in one box. We'll walk you through it on the phone if you want."</w:t>
             </w:r>
           </w:p>
         </w:tc>
@@ -1093,7 +1174,7 @@
                 <w:sz w:val="18"/>
                 <w:szCs w:val="18"/>
               </w:rPr>
-              <w:t xml:space="preserve">"Our equipment is new."</w:t>
+              <w:t xml:space="preserve">"We already check temperatures."</w:t>
             </w:r>
           </w:p>
         </w:tc>
@@ -1119,7 +1200,7 @@
                 <w:sz w:val="18"/>
                 <w:szCs w:val="18"/>
               </w:rPr>
-              <w:t xml:space="preserve">"New equipment fails too, and often it isn't the equipment at all. It's a door that didn't close or a breaker that tripped. Night Shift catches those as well."</w:t>
+              <w:t xml:space="preserve">"That's great, it means you care about this. The problem is the hours nobody's there: overnight and days you're closed. That's when coolers fail and nobody notices. And it writes the logs for you, so your staff gets that time back."</w:t>
             </w:r>
           </w:p>
         </w:tc>
@@ -1151,7 +1232,7 @@
                 <w:sz w:val="18"/>
                 <w:szCs w:val="18"/>
               </w:rPr>
-              <w:t xml:space="preserve">"What if the power or internet goes out?"</w:t>
+              <w:t xml:space="preserve">"Our equipment is new."</w:t>
             </w:r>
           </w:p>
         </w:tc>
@@ -1177,7 +1258,7 @@
                 <w:sz w:val="18"/>
                 <w:szCs w:val="18"/>
               </w:rPr>
-              <w:t xml:space="preserve">"If the internet goes out, the sensors store their readings and send them when it's back, so there are no gaps in your logs. We also offer a cellular version that doesn't use your internet. And if the gateway stops reporting, that alone sends an alert, which is often the first sign of a power outage."</w:t>
+              <w:t xml:space="preserve">"New equipment fails too, and often it isn't the equipment at all. It's a door that didn't close or a breaker that tripped. Night Shift catches those as well."</w:t>
             </w:r>
           </w:p>
         </w:tc>
@@ -1209,6 +1290,64 @@
                 <w:sz w:val="18"/>
                 <w:szCs w:val="18"/>
               </w:rPr>
+              <w:t xml:space="preserve">"What if the power or internet goes out?"</w:t>
+            </w:r>
+          </w:p>
+        </w:tc>
+        <w:tc>
+          <w:tcPr>
+            <w:tcW w:type="dxa" w:w="5989"/>
+            <w:tcBorders>
+              <w:top w:val="single" w:color="B8C8D8" w:sz="4"/>
+              <w:left w:val="single" w:color="B8C8D8" w:sz="4"/>
+              <w:bottom w:val="single" w:color="B8C8D8" w:sz="4"/>
+              <w:right w:val="single" w:color="B8C8D8" w:sz="4"/>
+            </w:tcBorders>
+            <w:tcMar>
+              <w:top w:type="dxa" w:w="60"/>
+              <w:left w:type="dxa" w:w="90"/>
+              <w:bottom w:type="dxa" w:w="60"/>
+              <w:right w:type="dxa" w:w="90"/>
+            </w:tcMar>
+          </w:tcPr>
+          <w:p>
+            <w:r>
+              <w:rPr>
+                <w:sz w:val="18"/>
+                <w:szCs w:val="18"/>
+              </w:rPr>
+              <w:t xml:space="preserve">"If the internet goes out, the sensors store their readings and send them when it's back, so there are no gaps in your logs. The cellular version doesn't use your internet at all. And if the gateway stops reporting, that alone sends an alert, which is often the first sign of a power outage."</w:t>
+            </w:r>
+          </w:p>
+        </w:tc>
+      </w:tr>
+      <w:tr>
+        <w:trPr>
+          <w:cantSplit/>
+          <w:tblHeader w:val="false"/>
+        </w:trPr>
+        <w:tc>
+          <w:tcPr>
+            <w:tcW w:type="dxa" w:w="4091"/>
+            <w:tcBorders>
+              <w:top w:val="single" w:color="B8C8D8" w:sz="4"/>
+              <w:left w:val="single" w:color="B8C8D8" w:sz="4"/>
+              <w:bottom w:val="single" w:color="B8C8D8" w:sz="4"/>
+              <w:right w:val="single" w:color="B8C8D8" w:sz="4"/>
+            </w:tcBorders>
+            <w:tcMar>
+              <w:top w:type="dxa" w:w="60"/>
+              <w:left w:type="dxa" w:w="90"/>
+              <w:bottom w:type="dxa" w:w="60"/>
+              <w:right w:type="dxa" w:w="90"/>
+            </w:tcMar>
+          </w:tcPr>
+          <w:p>
+            <w:r>
+              <w:rPr>
+                <w:sz w:val="18"/>
+                <w:szCs w:val="18"/>
+              </w:rPr>
               <w:t xml:space="preserve">"Just send me some information."</w:t>
             </w:r>
           </w:p>
@@ -1235,7 +1374,7 @@
                 <w:sz w:val="18"/>
                 <w:szCs w:val="18"/>
               </w:rPr>
-              <w:t xml:space="preserve">"Happy to. What's the best email? I'll send our site, where you can build your exact quote in under a minute. Can I follow up Thursday to answer questions?"</w:t>
+              <w:t xml:space="preserve">"Happy to. What's the best email? I'll send the live demo and your quote. Can I follow up Thursday to answer questions?"</w:t>
             </w:r>
           </w:p>
         </w:tc>
@@ -1306,6 +1445,7 @@
     </w:p>
     <w:p>
       <w:pPr>
+        <w:keepNext/>
         <w:spacing w:after="140"/>
       </w:pPr>
       <w:r>
@@ -1365,11 +1505,38 @@
         <w:spacing w:after="60"/>
       </w:pPr>
       <w:r>
-        <w:t xml:space="preserve">Any discount, free equipment, or free trial the owner hasn't approved in writing.</w:t>
+        <w:t xml:space="preserve">That someone will come install it. Setup is done by the owner, with phone help.</w:t>
       </w:r>
     </w:p>
     <w:p>
       <w:pPr>
+        <w:pStyle w:val="ListParagraph"/>
+        <w:numPr>
+          <w:ilvl w:val="0"/>
+          <w:numId w:val="2"/>
+        </w:numPr>
+        <w:spacing w:after="60"/>
+      </w:pPr>
+      <w:r>
+        <w:t xml:space="preserve">Any discount, free equipment, or free trial the owner hasn't approved in writing.</w:t>
+      </w:r>
+    </w:p>
+    <w:p>
+      <w:pPr>
+        <w:pStyle w:val="ListParagraph"/>
+        <w:numPr>
+          <w:ilvl w:val="0"/>
+          <w:numId w:val="2"/>
+        </w:numPr>
+        <w:spacing w:after="60"/>
+      </w:pPr>
+      <w:r>
+        <w:t xml:space="preserve">Never take card numbers over the phone. Payment only goes through the secure payment link.</w:t>
+      </w:r>
+    </w:p>
+    <w:p>
+      <w:pPr>
+        <w:keepNext w:val="false"/>
         <w:spacing w:after="140"/>
       </w:pPr>
       <w:r>
@@ -1393,14 +1560,16 @@
     </w:p>
     <w:p>
       <w:pPr>
+        <w:keepNext w:val="false"/>
         <w:spacing w:after="140"/>
       </w:pPr>
       <w:r>
-        <w:t xml:space="preserve">Phone reps earn $20 for each visit that actually happens plus 7.5% of each upfront sale: about $161 on a typical 5-unit kitchen, or 6% of what that customer pays in year one.</w:t>
+        <w:t xml:space="preserve">Reps earn a fixed dollar amount on every paid sale, plus 10% of every monitoring payment for as long as the customer keeps paying. On a typical 5-unit kitchen, that is $117 up front and $9.90 a month.</w:t>
       </w:r>
     </w:p>
     <w:p>
       <w:pPr>
+        <w:keepNext/>
         <w:spacing w:after="140"/>
       </w:pPr>
       <w:r>
@@ -1408,10 +1577,113 @@
           <w:b/>
           <w:bCs/>
         </w:rPr>
-        <w:t xml:space="preserve">What the company earns vs. what the rep earns</w:t>
-      </w:r>
-      <w:r>
-        <w:t xml:space="preserve"> (5-unit kitchen, internet-cable gateway, monthly plan)</w:t>
+        <w:t xml:space="preserve">Rates</w:t>
+      </w:r>
+    </w:p>
+    <w:p>
+      <w:pPr>
+        <w:pStyle w:val="ListParagraph"/>
+        <w:numPr>
+          <w:ilvl w:val="0"/>
+          <w:numId w:val="2"/>
+        </w:numPr>
+        <w:spacing w:after="60"/>
+      </w:pPr>
+      <w:r>
+        <w:rPr>
+          <w:b/>
+          <w:bCs/>
+        </w:rPr>
+        <w:t xml:space="preserve">$47 per location</w:t>
+      </w:r>
+      <w:r>
+        <w:t xml:space="preserve"> with an internet-cable gateway, or </w:t>
+      </w:r>
+      <w:r>
+        <w:rPr>
+          <w:b/>
+          <w:bCs/>
+        </w:rPr>
+        <w:t xml:space="preserve">$58</w:t>
+      </w:r>
+      <w:r>
+        <w:t xml:space="preserve"> with a cellular gateway.</w:t>
+      </w:r>
+    </w:p>
+    <w:p>
+      <w:pPr>
+        <w:pStyle w:val="ListParagraph"/>
+        <w:numPr>
+          <w:ilvl w:val="0"/>
+          <w:numId w:val="2"/>
+        </w:numPr>
+        <w:spacing w:after="60"/>
+      </w:pPr>
+      <w:r>
+        <w:rPr>
+          <w:b/>
+          <w:bCs/>
+        </w:rPr>
+        <w:t xml:space="preserve">$14 per sensor</w:t>
+      </w:r>
+      <w:r>
+        <w:t xml:space="preserve"> sold.</w:t>
+      </w:r>
+    </w:p>
+    <w:p>
+      <w:pPr>
+        <w:pStyle w:val="ListParagraph"/>
+        <w:numPr>
+          <w:ilvl w:val="0"/>
+          <w:numId w:val="2"/>
+        </w:numPr>
+        <w:spacing w:after="60"/>
+      </w:pPr>
+      <w:r>
+        <w:rPr>
+          <w:b/>
+          <w:bCs/>
+        </w:rPr>
+        <w:t xml:space="preserve">10% of every monitoring payment COOKd Kitchen receives</w:t>
+      </w:r>
+      <w:r>
+        <w:t xml:space="preserve"> from your customers, monthly or yearly, for as long as they keep paying and you stay active.</w:t>
+      </w:r>
+    </w:p>
+    <w:p>
+      <w:pPr>
+        <w:pStyle w:val="ListParagraph"/>
+        <w:numPr>
+          <w:ilvl w:val="0"/>
+          <w:numId w:val="2"/>
+        </w:numPr>
+        <w:spacing w:after="60"/>
+      </w:pPr>
+      <w:r>
+        <w:rPr>
+          <w:b/>
+          <w:bCs/>
+        </w:rPr>
+        <w:t xml:space="preserve">Nothing for calls, appointments, or quotes.</w:t>
+      </w:r>
+      <w:r>
+        <w:t xml:space="preserve"> Only paid sales earn commission.</w:t>
+      </w:r>
+    </w:p>
+    <w:p>
+      <w:pPr>
+        <w:keepNext/>
+        <w:spacing w:after="140"/>
+      </w:pPr>
+      <w:r>
+        <w:rPr>
+          <w:b/>
+          <w:bCs/>
+        </w:rPr>
+        <w:t xml:space="preserve">What one sale pays</w:t>
+      </w:r>
+      <w:r>
+        <w:t xml:space="preserve"> (internet-cable gateway, monthly plan)</w:t>
       </w:r>
     </w:p>
     <w:tbl>
@@ -1427,9 +1699,11 @@
         </w:tblBorders>
       </w:tblPr>
       <w:tblGrid>
-        <w:gridCol w:w="6225"/>
-        <w:gridCol w:w="1482"/>
-        <w:gridCol w:w="2373"/>
+        <w:gridCol w:w="1221"/>
+        <w:gridCol w:w="2240"/>
+        <w:gridCol w:w="2341"/>
+        <w:gridCol w:w="2138"/>
+        <w:gridCol w:w="2140"/>
       </w:tblGrid>
       <w:tr>
         <w:trPr>
@@ -1438,26 +1712,7 @@
         </w:trPr>
         <w:tc>
           <w:tcPr>
-            <w:tcW w:type="dxa" w:w="6225"/>
-            <w:tcBorders>
-              <w:top w:val="single" w:color="B8C8D8" w:sz="4"/>
-              <w:left w:val="single" w:color="B8C8D8" w:sz="4"/>
-              <w:bottom w:val="single" w:color="B8C8D8" w:sz="4"/>
-              <w:right w:val="single" w:color="B8C8D8" w:sz="4"/>
-            </w:tcBorders>
-            <w:shd w:fill="DCEAF4" w:color="auto" w:val="clear"/>
-            <w:tcMar>
-              <w:top w:type="dxa" w:w="60"/>
-              <w:left w:type="dxa" w:w="90"/>
-              <w:bottom w:type="dxa" w:w="60"/>
-              <w:right w:type="dxa" w:w="90"/>
-            </w:tcMar>
-          </w:tcPr>
-          <w:p/>
-        </w:tc>
-        <w:tc>
-          <w:tcPr>
-            <w:tcW w:type="dxa" w:w="1482"/>
+            <w:tcW w:type="dxa" w:w="1221"/>
             <w:tcBorders>
               <w:top w:val="single" w:color="B8C8D8" w:sz="4"/>
               <w:left w:val="single" w:color="B8C8D8" w:sz="4"/>
@@ -1481,13 +1736,13 @@
                 <w:sz w:val="18"/>
                 <w:szCs w:val="18"/>
               </w:rPr>
-              <w:t xml:space="preserve">First year</w:t>
-            </w:r>
-          </w:p>
-        </w:tc>
-        <w:tc>
-          <w:tcPr>
-            <w:tcW w:type="dxa" w:w="2373"/>
+              <w:t xml:space="preserve">Kitchen size</w:t>
+            </w:r>
+          </w:p>
+        </w:tc>
+        <w:tc>
+          <w:tcPr>
+            <w:tcW w:type="dxa" w:w="2240"/>
             <w:tcBorders>
               <w:top w:val="single" w:color="B8C8D8" w:sz="4"/>
               <w:left w:val="single" w:color="B8C8D8" w:sz="4"/>
@@ -1511,7 +1766,97 @@
                 <w:sz w:val="18"/>
                 <w:szCs w:val="18"/>
               </w:rPr>
-              <w:t xml:space="preserve">Every year after</w:t>
+              <w:t xml:space="preserve">Customer pays up front</w:t>
+            </w:r>
+          </w:p>
+        </w:tc>
+        <w:tc>
+          <w:tcPr>
+            <w:tcW w:type="dxa" w:w="2341"/>
+            <w:tcBorders>
+              <w:top w:val="single" w:color="B8C8D8" w:sz="4"/>
+              <w:left w:val="single" w:color="B8C8D8" w:sz="4"/>
+              <w:bottom w:val="single" w:color="B8C8D8" w:sz="4"/>
+              <w:right w:val="single" w:color="B8C8D8" w:sz="4"/>
+            </w:tcBorders>
+            <w:shd w:fill="DCEAF4" w:color="auto" w:val="clear"/>
+            <w:tcMar>
+              <w:top w:type="dxa" w:w="60"/>
+              <w:left w:type="dxa" w:w="90"/>
+              <w:bottom w:type="dxa" w:w="60"/>
+              <w:right w:type="dxa" w:w="90"/>
+            </w:tcMar>
+          </w:tcPr>
+          <w:p>
+            <w:r>
+              <w:rPr>
+                <w:b/>
+                <w:bCs/>
+                <w:color w:val="0B2A4A"/>
+                <w:sz w:val="18"/>
+                <w:szCs w:val="18"/>
+              </w:rPr>
+              <w:t xml:space="preserve">Your upfront commission</w:t>
+            </w:r>
+          </w:p>
+        </w:tc>
+        <w:tc>
+          <w:tcPr>
+            <w:tcW w:type="dxa" w:w="2138"/>
+            <w:tcBorders>
+              <w:top w:val="single" w:color="B8C8D8" w:sz="4"/>
+              <w:left w:val="single" w:color="B8C8D8" w:sz="4"/>
+              <w:bottom w:val="single" w:color="B8C8D8" w:sz="4"/>
+              <w:right w:val="single" w:color="B8C8D8" w:sz="4"/>
+            </w:tcBorders>
+            <w:shd w:fill="DCEAF4" w:color="auto" w:val="clear"/>
+            <w:tcMar>
+              <w:top w:type="dxa" w:w="60"/>
+              <w:left w:type="dxa" w:w="90"/>
+              <w:bottom w:type="dxa" w:w="60"/>
+              <w:right w:type="dxa" w:w="90"/>
+            </w:tcMar>
+          </w:tcPr>
+          <w:p>
+            <w:r>
+              <w:rPr>
+                <w:b/>
+                <w:bCs/>
+                <w:color w:val="0B2A4A"/>
+                <w:sz w:val="18"/>
+                <w:szCs w:val="18"/>
+              </w:rPr>
+              <w:t xml:space="preserve">Customer pays monthly</w:t>
+            </w:r>
+          </w:p>
+        </w:tc>
+        <w:tc>
+          <w:tcPr>
+            <w:tcW w:type="dxa" w:w="2140"/>
+            <w:tcBorders>
+              <w:top w:val="single" w:color="B8C8D8" w:sz="4"/>
+              <w:left w:val="single" w:color="B8C8D8" w:sz="4"/>
+              <w:bottom w:val="single" w:color="B8C8D8" w:sz="4"/>
+              <w:right w:val="single" w:color="B8C8D8" w:sz="4"/>
+            </w:tcBorders>
+            <w:shd w:fill="DCEAF4" w:color="auto" w:val="clear"/>
+            <w:tcMar>
+              <w:top w:type="dxa" w:w="60"/>
+              <w:left w:type="dxa" w:w="90"/>
+              <w:bottom w:type="dxa" w:w="60"/>
+              <w:right w:type="dxa" w:w="90"/>
+            </w:tcMar>
+          </w:tcPr>
+          <w:p>
+            <w:r>
+              <w:rPr>
+                <w:b/>
+                <w:bCs/>
+                <w:color w:val="0B2A4A"/>
+                <w:sz w:val="18"/>
+                <w:szCs w:val="18"/>
+              </w:rPr>
+              <w:t xml:space="preserve">Your monthly residual</w:t>
             </w:r>
           </w:p>
         </w:tc>
@@ -1523,79 +1868,131 @@
         </w:trPr>
         <w:tc>
           <w:tcPr>
-            <w:tcW w:type="dxa" w:w="6225"/>
-            <w:tcBorders>
-              <w:top w:val="single" w:color="B8C8D8" w:sz="4"/>
-              <w:left w:val="single" w:color="B8C8D8" w:sz="4"/>
-              <w:bottom w:val="single" w:color="B8C8D8" w:sz="4"/>
-              <w:right w:val="single" w:color="B8C8D8" w:sz="4"/>
-            </w:tcBorders>
-            <w:tcMar>
-              <w:top w:type="dxa" w:w="60"/>
-              <w:left w:type="dxa" w:w="90"/>
-              <w:bottom w:type="dxa" w:w="60"/>
-              <w:right w:type="dxa" w:w="90"/>
-            </w:tcMar>
-          </w:tcPr>
-          <w:p>
-            <w:r>
-              <w:rPr>
-                <w:sz w:val="18"/>
-                <w:szCs w:val="18"/>
-              </w:rPr>
-              <w:t xml:space="preserve">Customer pays</w:t>
-            </w:r>
-          </w:p>
-        </w:tc>
-        <w:tc>
-          <w:tcPr>
-            <w:tcW w:type="dxa" w:w="1482"/>
-            <w:tcBorders>
-              <w:top w:val="single" w:color="B8C8D8" w:sz="4"/>
-              <w:left w:val="single" w:color="B8C8D8" w:sz="4"/>
-              <w:bottom w:val="single" w:color="B8C8D8" w:sz="4"/>
-              <w:right w:val="single" w:color="B8C8D8" w:sz="4"/>
-            </w:tcBorders>
-            <w:tcMar>
-              <w:top w:type="dxa" w:w="60"/>
-              <w:left w:type="dxa" w:w="90"/>
-              <w:bottom w:type="dxa" w:w="60"/>
-              <w:right w:type="dxa" w:w="90"/>
-            </w:tcMar>
-          </w:tcPr>
-          <w:p>
-            <w:r>
-              <w:rPr>
-                <w:sz w:val="18"/>
-                <w:szCs w:val="18"/>
-              </w:rPr>
-              <w:t xml:space="preserve">$2,531</w:t>
-            </w:r>
-          </w:p>
-        </w:tc>
-        <w:tc>
-          <w:tcPr>
-            <w:tcW w:type="dxa" w:w="2373"/>
-            <w:tcBorders>
-              <w:top w:val="single" w:color="B8C8D8" w:sz="4"/>
-              <w:left w:val="single" w:color="B8C8D8" w:sz="4"/>
-              <w:bottom w:val="single" w:color="B8C8D8" w:sz="4"/>
-              <w:right w:val="single" w:color="B8C8D8" w:sz="4"/>
-            </w:tcBorders>
-            <w:tcMar>
-              <w:top w:type="dxa" w:w="60"/>
-              <w:left w:type="dxa" w:w="90"/>
-              <w:bottom w:type="dxa" w:w="60"/>
-              <w:right w:type="dxa" w:w="90"/>
-            </w:tcMar>
-          </w:tcPr>
-          <w:p>
-            <w:r>
-              <w:rPr>
-                <w:sz w:val="18"/>
-                <w:szCs w:val="18"/>
-              </w:rPr>
-              <w:t xml:space="preserve">$1,188</w:t>
+            <w:tcW w:type="dxa" w:w="1221"/>
+            <w:tcBorders>
+              <w:top w:val="single" w:color="B8C8D8" w:sz="4"/>
+              <w:left w:val="single" w:color="B8C8D8" w:sz="4"/>
+              <w:bottom w:val="single" w:color="B8C8D8" w:sz="4"/>
+              <w:right w:val="single" w:color="B8C8D8" w:sz="4"/>
+            </w:tcBorders>
+            <w:tcMar>
+              <w:top w:type="dxa" w:w="60"/>
+              <w:left w:type="dxa" w:w="90"/>
+              <w:bottom w:type="dxa" w:w="60"/>
+              <w:right w:type="dxa" w:w="90"/>
+            </w:tcMar>
+          </w:tcPr>
+          <w:p>
+            <w:r>
+              <w:rPr>
+                <w:sz w:val="18"/>
+                <w:szCs w:val="18"/>
+              </w:rPr>
+              <w:t xml:space="preserve">3 units</w:t>
+            </w:r>
+          </w:p>
+        </w:tc>
+        <w:tc>
+          <w:tcPr>
+            <w:tcW w:type="dxa" w:w="2240"/>
+            <w:tcBorders>
+              <w:top w:val="single" w:color="B8C8D8" w:sz="4"/>
+              <w:left w:val="single" w:color="B8C8D8" w:sz="4"/>
+              <w:bottom w:val="single" w:color="B8C8D8" w:sz="4"/>
+              <w:right w:val="single" w:color="B8C8D8" w:sz="4"/>
+            </w:tcBorders>
+            <w:tcMar>
+              <w:top w:type="dxa" w:w="60"/>
+              <w:left w:type="dxa" w:w="90"/>
+              <w:bottom w:type="dxa" w:w="60"/>
+              <w:right w:type="dxa" w:w="90"/>
+            </w:tcMar>
+          </w:tcPr>
+          <w:p>
+            <w:r>
+              <w:rPr>
+                <w:sz w:val="18"/>
+                <w:szCs w:val="18"/>
+              </w:rPr>
+              <w:t xml:space="preserve">$995</w:t>
+            </w:r>
+          </w:p>
+        </w:tc>
+        <w:tc>
+          <w:tcPr>
+            <w:tcW w:type="dxa" w:w="2341"/>
+            <w:tcBorders>
+              <w:top w:val="single" w:color="B8C8D8" w:sz="4"/>
+              <w:left w:val="single" w:color="B8C8D8" w:sz="4"/>
+              <w:bottom w:val="single" w:color="B8C8D8" w:sz="4"/>
+              <w:right w:val="single" w:color="B8C8D8" w:sz="4"/>
+            </w:tcBorders>
+            <w:tcMar>
+              <w:top w:type="dxa" w:w="60"/>
+              <w:left w:type="dxa" w:w="90"/>
+              <w:bottom w:type="dxa" w:w="60"/>
+              <w:right w:type="dxa" w:w="90"/>
+            </w:tcMar>
+          </w:tcPr>
+          <w:p>
+            <w:r>
+              <w:rPr>
+                <w:sz w:val="18"/>
+                <w:szCs w:val="18"/>
+              </w:rPr>
+              <w:t xml:space="preserve">$89</w:t>
+            </w:r>
+          </w:p>
+        </w:tc>
+        <w:tc>
+          <w:tcPr>
+            <w:tcW w:type="dxa" w:w="2138"/>
+            <w:tcBorders>
+              <w:top w:val="single" w:color="B8C8D8" w:sz="4"/>
+              <w:left w:val="single" w:color="B8C8D8" w:sz="4"/>
+              <w:bottom w:val="single" w:color="B8C8D8" w:sz="4"/>
+              <w:right w:val="single" w:color="B8C8D8" w:sz="4"/>
+            </w:tcBorders>
+            <w:tcMar>
+              <w:top w:type="dxa" w:w="60"/>
+              <w:left w:type="dxa" w:w="90"/>
+              <w:bottom w:type="dxa" w:w="60"/>
+              <w:right w:type="dxa" w:w="90"/>
+            </w:tcMar>
+          </w:tcPr>
+          <w:p>
+            <w:r>
+              <w:rPr>
+                <w:sz w:val="18"/>
+                <w:szCs w:val="18"/>
+              </w:rPr>
+              <w:t xml:space="preserve">$79</w:t>
+            </w:r>
+          </w:p>
+        </w:tc>
+        <w:tc>
+          <w:tcPr>
+            <w:tcW w:type="dxa" w:w="2140"/>
+            <w:tcBorders>
+              <w:top w:val="single" w:color="B8C8D8" w:sz="4"/>
+              <w:left w:val="single" w:color="B8C8D8" w:sz="4"/>
+              <w:bottom w:val="single" w:color="B8C8D8" w:sz="4"/>
+              <w:right w:val="single" w:color="B8C8D8" w:sz="4"/>
+            </w:tcBorders>
+            <w:tcMar>
+              <w:top w:type="dxa" w:w="60"/>
+              <w:left w:type="dxa" w:w="90"/>
+              <w:bottom w:type="dxa" w:w="60"/>
+              <w:right w:type="dxa" w:w="90"/>
+            </w:tcMar>
+          </w:tcPr>
+          <w:p>
+            <w:r>
+              <w:rPr>
+                <w:sz w:val="18"/>
+                <w:szCs w:val="18"/>
+              </w:rPr>
+              <w:t xml:space="preserve">$7.90</w:t>
             </w:r>
           </w:p>
         </w:tc>
@@ -1607,79 +2004,131 @@
         </w:trPr>
         <w:tc>
           <w:tcPr>
-            <w:tcW w:type="dxa" w:w="6225"/>
-            <w:tcBorders>
-              <w:top w:val="single" w:color="B8C8D8" w:sz="4"/>
-              <w:left w:val="single" w:color="B8C8D8" w:sz="4"/>
-              <w:bottom w:val="single" w:color="B8C8D8" w:sz="4"/>
-              <w:right w:val="single" w:color="B8C8D8" w:sz="4"/>
-            </w:tcBorders>
-            <w:tcMar>
-              <w:top w:type="dxa" w:w="60"/>
-              <w:left w:type="dxa" w:w="90"/>
-              <w:bottom w:type="dxa" w:w="60"/>
-              <w:right w:type="dxa" w:w="90"/>
-            </w:tcMar>
-          </w:tcPr>
-          <w:p>
-            <w:r>
-              <w:rPr>
-                <w:sz w:val="18"/>
-                <w:szCs w:val="18"/>
-              </w:rPr>
-              <w:t xml:space="preserve">Equipment, installation, and service costs</w:t>
-            </w:r>
-          </w:p>
-        </w:tc>
-        <w:tc>
-          <w:tcPr>
-            <w:tcW w:type="dxa" w:w="1482"/>
-            <w:tcBorders>
-              <w:top w:val="single" w:color="B8C8D8" w:sz="4"/>
-              <w:left w:val="single" w:color="B8C8D8" w:sz="4"/>
-              <w:bottom w:val="single" w:color="B8C8D8" w:sz="4"/>
-              <w:right w:val="single" w:color="B8C8D8" w:sz="4"/>
-            </w:tcBorders>
-            <w:tcMar>
-              <w:top w:type="dxa" w:w="60"/>
-              <w:left w:type="dxa" w:w="90"/>
-              <w:bottom w:type="dxa" w:w="60"/>
-              <w:right w:type="dxa" w:w="90"/>
-            </w:tcMar>
-          </w:tcPr>
-          <w:p>
-            <w:r>
-              <w:rPr>
-                <w:sz w:val="18"/>
-                <w:szCs w:val="18"/>
-              </w:rPr>
-              <w:t xml:space="preserve">$1,125</w:t>
-            </w:r>
-          </w:p>
-        </w:tc>
-        <w:tc>
-          <w:tcPr>
-            <w:tcW w:type="dxa" w:w="2373"/>
-            <w:tcBorders>
-              <w:top w:val="single" w:color="B8C8D8" w:sz="4"/>
-              <w:left w:val="single" w:color="B8C8D8" w:sz="4"/>
-              <w:bottom w:val="single" w:color="B8C8D8" w:sz="4"/>
-              <w:right w:val="single" w:color="B8C8D8" w:sz="4"/>
-            </w:tcBorders>
-            <w:tcMar>
-              <w:top w:type="dxa" w:w="60"/>
-              <w:left w:type="dxa" w:w="90"/>
-              <w:bottom w:type="dxa" w:w="60"/>
-              <w:right w:type="dxa" w:w="90"/>
-            </w:tcMar>
-          </w:tcPr>
-          <w:p>
-            <w:r>
-              <w:rPr>
-                <w:sz w:val="18"/>
-                <w:szCs w:val="18"/>
-              </w:rPr>
-              <w:t xml:space="preserve">$300</w:t>
+            <w:tcW w:type="dxa" w:w="1221"/>
+            <w:tcBorders>
+              <w:top w:val="single" w:color="B8C8D8" w:sz="4"/>
+              <w:left w:val="single" w:color="B8C8D8" w:sz="4"/>
+              <w:bottom w:val="single" w:color="B8C8D8" w:sz="4"/>
+              <w:right w:val="single" w:color="B8C8D8" w:sz="4"/>
+            </w:tcBorders>
+            <w:tcMar>
+              <w:top w:type="dxa" w:w="60"/>
+              <w:left w:type="dxa" w:w="90"/>
+              <w:bottom w:type="dxa" w:w="60"/>
+              <w:right w:type="dxa" w:w="90"/>
+            </w:tcMar>
+          </w:tcPr>
+          <w:p>
+            <w:r>
+              <w:rPr>
+                <w:sz w:val="18"/>
+                <w:szCs w:val="18"/>
+              </w:rPr>
+              <w:t xml:space="preserve">5 units</w:t>
+            </w:r>
+          </w:p>
+        </w:tc>
+        <w:tc>
+          <w:tcPr>
+            <w:tcW w:type="dxa" w:w="2240"/>
+            <w:tcBorders>
+              <w:top w:val="single" w:color="B8C8D8" w:sz="4"/>
+              <w:left w:val="single" w:color="B8C8D8" w:sz="4"/>
+              <w:bottom w:val="single" w:color="B8C8D8" w:sz="4"/>
+              <w:right w:val="single" w:color="B8C8D8" w:sz="4"/>
+            </w:tcBorders>
+            <w:tcMar>
+              <w:top w:type="dxa" w:w="60"/>
+              <w:left w:type="dxa" w:w="90"/>
+              <w:bottom w:type="dxa" w:w="60"/>
+              <w:right w:type="dxa" w:w="90"/>
+            </w:tcMar>
+          </w:tcPr>
+          <w:p>
+            <w:r>
+              <w:rPr>
+                <w:sz w:val="18"/>
+                <w:szCs w:val="18"/>
+              </w:rPr>
+              <w:t xml:space="preserve">$1,393</w:t>
+            </w:r>
+          </w:p>
+        </w:tc>
+        <w:tc>
+          <w:tcPr>
+            <w:tcW w:type="dxa" w:w="2341"/>
+            <w:tcBorders>
+              <w:top w:val="single" w:color="B8C8D8" w:sz="4"/>
+              <w:left w:val="single" w:color="B8C8D8" w:sz="4"/>
+              <w:bottom w:val="single" w:color="B8C8D8" w:sz="4"/>
+              <w:right w:val="single" w:color="B8C8D8" w:sz="4"/>
+            </w:tcBorders>
+            <w:tcMar>
+              <w:top w:type="dxa" w:w="60"/>
+              <w:left w:type="dxa" w:w="90"/>
+              <w:bottom w:type="dxa" w:w="60"/>
+              <w:right w:type="dxa" w:w="90"/>
+            </w:tcMar>
+          </w:tcPr>
+          <w:p>
+            <w:r>
+              <w:rPr>
+                <w:sz w:val="18"/>
+                <w:szCs w:val="18"/>
+              </w:rPr>
+              <w:t xml:space="preserve">$117</w:t>
+            </w:r>
+          </w:p>
+        </w:tc>
+        <w:tc>
+          <w:tcPr>
+            <w:tcW w:type="dxa" w:w="2138"/>
+            <w:tcBorders>
+              <w:top w:val="single" w:color="B8C8D8" w:sz="4"/>
+              <w:left w:val="single" w:color="B8C8D8" w:sz="4"/>
+              <w:bottom w:val="single" w:color="B8C8D8" w:sz="4"/>
+              <w:right w:val="single" w:color="B8C8D8" w:sz="4"/>
+            </w:tcBorders>
+            <w:tcMar>
+              <w:top w:type="dxa" w:w="60"/>
+              <w:left w:type="dxa" w:w="90"/>
+              <w:bottom w:type="dxa" w:w="60"/>
+              <w:right w:type="dxa" w:w="90"/>
+            </w:tcMar>
+          </w:tcPr>
+          <w:p>
+            <w:r>
+              <w:rPr>
+                <w:sz w:val="18"/>
+                <w:szCs w:val="18"/>
+              </w:rPr>
+              <w:t xml:space="preserve">$99</w:t>
+            </w:r>
+          </w:p>
+        </w:tc>
+        <w:tc>
+          <w:tcPr>
+            <w:tcW w:type="dxa" w:w="2140"/>
+            <w:tcBorders>
+              <w:top w:val="single" w:color="B8C8D8" w:sz="4"/>
+              <w:left w:val="single" w:color="B8C8D8" w:sz="4"/>
+              <w:bottom w:val="single" w:color="B8C8D8" w:sz="4"/>
+              <w:right w:val="single" w:color="B8C8D8" w:sz="4"/>
+            </w:tcBorders>
+            <w:tcMar>
+              <w:top w:type="dxa" w:w="60"/>
+              <w:left w:type="dxa" w:w="90"/>
+              <w:bottom w:type="dxa" w:w="60"/>
+              <w:right w:type="dxa" w:w="90"/>
+            </w:tcMar>
+          </w:tcPr>
+          <w:p>
+            <w:r>
+              <w:rPr>
+                <w:sz w:val="18"/>
+                <w:szCs w:val="18"/>
+              </w:rPr>
+              <w:t xml:space="preserve">$9.90</w:t>
             </w:r>
           </w:p>
         </w:tc>
@@ -1691,79 +2140,131 @@
         </w:trPr>
         <w:tc>
           <w:tcPr>
-            <w:tcW w:type="dxa" w:w="6225"/>
-            <w:tcBorders>
-              <w:top w:val="single" w:color="B8C8D8" w:sz="4"/>
-              <w:left w:val="single" w:color="B8C8D8" w:sz="4"/>
-              <w:bottom w:val="single" w:color="B8C8D8" w:sz="4"/>
-              <w:right w:val="single" w:color="B8C8D8" w:sz="4"/>
-            </w:tcBorders>
-            <w:tcMar>
-              <w:top w:type="dxa" w:w="60"/>
-              <w:left w:type="dxa" w:w="90"/>
-              <w:bottom w:type="dxa" w:w="60"/>
-              <w:right w:type="dxa" w:w="90"/>
-            </w:tcMar>
-          </w:tcPr>
-          <w:p>
-            <w:r>
-              <w:rPr>
-                <w:sz w:val="18"/>
-                <w:szCs w:val="18"/>
-              </w:rPr>
-              <w:t xml:space="preserve">Company profit before commission</w:t>
-            </w:r>
-          </w:p>
-        </w:tc>
-        <w:tc>
-          <w:tcPr>
-            <w:tcW w:type="dxa" w:w="1482"/>
-            <w:tcBorders>
-              <w:top w:val="single" w:color="B8C8D8" w:sz="4"/>
-              <w:left w:val="single" w:color="B8C8D8" w:sz="4"/>
-              <w:bottom w:val="single" w:color="B8C8D8" w:sz="4"/>
-              <w:right w:val="single" w:color="B8C8D8" w:sz="4"/>
-            </w:tcBorders>
-            <w:tcMar>
-              <w:top w:type="dxa" w:w="60"/>
-              <w:left w:type="dxa" w:w="90"/>
-              <w:bottom w:type="dxa" w:w="60"/>
-              <w:right w:type="dxa" w:w="90"/>
-            </w:tcMar>
-          </w:tcPr>
-          <w:p>
-            <w:r>
-              <w:rPr>
-                <w:sz w:val="18"/>
-                <w:szCs w:val="18"/>
-              </w:rPr>
-              <w:t xml:space="preserve">$1,406</w:t>
-            </w:r>
-          </w:p>
-        </w:tc>
-        <w:tc>
-          <w:tcPr>
-            <w:tcW w:type="dxa" w:w="2373"/>
-            <w:tcBorders>
-              <w:top w:val="single" w:color="B8C8D8" w:sz="4"/>
-              <w:left w:val="single" w:color="B8C8D8" w:sz="4"/>
-              <w:bottom w:val="single" w:color="B8C8D8" w:sz="4"/>
-              <w:right w:val="single" w:color="B8C8D8" w:sz="4"/>
-            </w:tcBorders>
-            <w:tcMar>
-              <w:top w:type="dxa" w:w="60"/>
-              <w:left w:type="dxa" w:w="90"/>
-              <w:bottom w:type="dxa" w:w="60"/>
-              <w:right w:type="dxa" w:w="90"/>
-            </w:tcMar>
-          </w:tcPr>
-          <w:p>
-            <w:r>
-              <w:rPr>
-                <w:sz w:val="18"/>
-                <w:szCs w:val="18"/>
-              </w:rPr>
-              <w:t xml:space="preserve">$888</w:t>
+            <w:tcW w:type="dxa" w:w="1221"/>
+            <w:tcBorders>
+              <w:top w:val="single" w:color="B8C8D8" w:sz="4"/>
+              <w:left w:val="single" w:color="B8C8D8" w:sz="4"/>
+              <w:bottom w:val="single" w:color="B8C8D8" w:sz="4"/>
+              <w:right w:val="single" w:color="B8C8D8" w:sz="4"/>
+            </w:tcBorders>
+            <w:tcMar>
+              <w:top w:type="dxa" w:w="60"/>
+              <w:left w:type="dxa" w:w="90"/>
+              <w:bottom w:type="dxa" w:w="60"/>
+              <w:right w:type="dxa" w:w="90"/>
+            </w:tcMar>
+          </w:tcPr>
+          <w:p>
+            <w:r>
+              <w:rPr>
+                <w:sz w:val="18"/>
+                <w:szCs w:val="18"/>
+              </w:rPr>
+              <w:t xml:space="preserve">8 units</w:t>
+            </w:r>
+          </w:p>
+        </w:tc>
+        <w:tc>
+          <w:tcPr>
+            <w:tcW w:type="dxa" w:w="2240"/>
+            <w:tcBorders>
+              <w:top w:val="single" w:color="B8C8D8" w:sz="4"/>
+              <w:left w:val="single" w:color="B8C8D8" w:sz="4"/>
+              <w:bottom w:val="single" w:color="B8C8D8" w:sz="4"/>
+              <w:right w:val="single" w:color="B8C8D8" w:sz="4"/>
+            </w:tcBorders>
+            <w:tcMar>
+              <w:top w:type="dxa" w:w="60"/>
+              <w:left w:type="dxa" w:w="90"/>
+              <w:bottom w:type="dxa" w:w="60"/>
+              <w:right w:type="dxa" w:w="90"/>
+            </w:tcMar>
+          </w:tcPr>
+          <w:p>
+            <w:r>
+              <w:rPr>
+                <w:sz w:val="18"/>
+                <w:szCs w:val="18"/>
+              </w:rPr>
+              <w:t xml:space="preserve">$1,990</w:t>
+            </w:r>
+          </w:p>
+        </w:tc>
+        <w:tc>
+          <w:tcPr>
+            <w:tcW w:type="dxa" w:w="2341"/>
+            <w:tcBorders>
+              <w:top w:val="single" w:color="B8C8D8" w:sz="4"/>
+              <w:left w:val="single" w:color="B8C8D8" w:sz="4"/>
+              <w:bottom w:val="single" w:color="B8C8D8" w:sz="4"/>
+              <w:right w:val="single" w:color="B8C8D8" w:sz="4"/>
+            </w:tcBorders>
+            <w:tcMar>
+              <w:top w:type="dxa" w:w="60"/>
+              <w:left w:type="dxa" w:w="90"/>
+              <w:bottom w:type="dxa" w:w="60"/>
+              <w:right w:type="dxa" w:w="90"/>
+            </w:tcMar>
+          </w:tcPr>
+          <w:p>
+            <w:r>
+              <w:rPr>
+                <w:sz w:val="18"/>
+                <w:szCs w:val="18"/>
+              </w:rPr>
+              <w:t xml:space="preserve">$159</w:t>
+            </w:r>
+          </w:p>
+        </w:tc>
+        <w:tc>
+          <w:tcPr>
+            <w:tcW w:type="dxa" w:w="2138"/>
+            <w:tcBorders>
+              <w:top w:val="single" w:color="B8C8D8" w:sz="4"/>
+              <w:left w:val="single" w:color="B8C8D8" w:sz="4"/>
+              <w:bottom w:val="single" w:color="B8C8D8" w:sz="4"/>
+              <w:right w:val="single" w:color="B8C8D8" w:sz="4"/>
+            </w:tcBorders>
+            <w:tcMar>
+              <w:top w:type="dxa" w:w="60"/>
+              <w:left w:type="dxa" w:w="90"/>
+              <w:bottom w:type="dxa" w:w="60"/>
+              <w:right w:type="dxa" w:w="90"/>
+            </w:tcMar>
+          </w:tcPr>
+          <w:p>
+            <w:r>
+              <w:rPr>
+                <w:sz w:val="18"/>
+                <w:szCs w:val="18"/>
+              </w:rPr>
+              <w:t xml:space="preserve">$129</w:t>
+            </w:r>
+          </w:p>
+        </w:tc>
+        <w:tc>
+          <w:tcPr>
+            <w:tcW w:type="dxa" w:w="2140"/>
+            <w:tcBorders>
+              <w:top w:val="single" w:color="B8C8D8" w:sz="4"/>
+              <w:left w:val="single" w:color="B8C8D8" w:sz="4"/>
+              <w:bottom w:val="single" w:color="B8C8D8" w:sz="4"/>
+              <w:right w:val="single" w:color="B8C8D8" w:sz="4"/>
+            </w:tcBorders>
+            <w:tcMar>
+              <w:top w:type="dxa" w:w="60"/>
+              <w:left w:type="dxa" w:w="90"/>
+              <w:bottom w:type="dxa" w:w="60"/>
+              <w:right w:type="dxa" w:w="90"/>
+            </w:tcMar>
+          </w:tcPr>
+          <w:p>
+            <w:r>
+              <w:rPr>
+                <w:sz w:val="18"/>
+                <w:szCs w:val="18"/>
+              </w:rPr>
+              <w:t xml:space="preserve">$12.90</w:t>
             </w:r>
           </w:p>
         </w:tc>
@@ -1775,163 +2276,131 @@
         </w:trPr>
         <w:tc>
           <w:tcPr>
-            <w:tcW w:type="dxa" w:w="6225"/>
-            <w:tcBorders>
-              <w:top w:val="single" w:color="B8C8D8" w:sz="4"/>
-              <w:left w:val="single" w:color="B8C8D8" w:sz="4"/>
-              <w:bottom w:val="single" w:color="B8C8D8" w:sz="4"/>
-              <w:right w:val="single" w:color="B8C8D8" w:sz="4"/>
-            </w:tcBorders>
-            <w:tcMar>
-              <w:top w:type="dxa" w:w="60"/>
-              <w:left w:type="dxa" w:w="90"/>
-              <w:bottom w:type="dxa" w:w="60"/>
-              <w:right w:type="dxa" w:w="90"/>
-            </w:tcMar>
-          </w:tcPr>
-          <w:p>
-            <w:r>
-              <w:rPr>
-                <w:sz w:val="18"/>
-                <w:szCs w:val="18"/>
-              </w:rPr>
-              <w:t xml:space="preserve">Rep commission</w:t>
-            </w:r>
-          </w:p>
-        </w:tc>
-        <w:tc>
-          <w:tcPr>
-            <w:tcW w:type="dxa" w:w="1482"/>
-            <w:tcBorders>
-              <w:top w:val="single" w:color="B8C8D8" w:sz="4"/>
-              <w:left w:val="single" w:color="B8C8D8" w:sz="4"/>
-              <w:bottom w:val="single" w:color="B8C8D8" w:sz="4"/>
-              <w:right w:val="single" w:color="B8C8D8" w:sz="4"/>
-            </w:tcBorders>
-            <w:tcMar>
-              <w:top w:type="dxa" w:w="60"/>
-              <w:left w:type="dxa" w:w="90"/>
-              <w:bottom w:type="dxa" w:w="60"/>
-              <w:right w:type="dxa" w:w="90"/>
-            </w:tcMar>
-          </w:tcPr>
-          <w:p>
-            <w:r>
-              <w:rPr>
-                <w:sz w:val="18"/>
-                <w:szCs w:val="18"/>
-              </w:rPr>
-              <w:t xml:space="preserve">$161</w:t>
-            </w:r>
-          </w:p>
-        </w:tc>
-        <w:tc>
-          <w:tcPr>
-            <w:tcW w:type="dxa" w:w="2373"/>
-            <w:tcBorders>
-              <w:top w:val="single" w:color="B8C8D8" w:sz="4"/>
-              <w:left w:val="single" w:color="B8C8D8" w:sz="4"/>
-              <w:bottom w:val="single" w:color="B8C8D8" w:sz="4"/>
-              <w:right w:val="single" w:color="B8C8D8" w:sz="4"/>
-            </w:tcBorders>
-            <w:tcMar>
-              <w:top w:type="dxa" w:w="60"/>
-              <w:left w:type="dxa" w:w="90"/>
-              <w:bottom w:type="dxa" w:w="60"/>
-              <w:right w:type="dxa" w:w="90"/>
-            </w:tcMar>
-          </w:tcPr>
-          <w:p>
-            <w:r>
-              <w:rPr>
-                <w:sz w:val="18"/>
-                <w:szCs w:val="18"/>
-              </w:rPr>
-              <w:t xml:space="preserve">$0</w:t>
-            </w:r>
-          </w:p>
-        </w:tc>
-      </w:tr>
-      <w:tr>
-        <w:trPr>
-          <w:cantSplit/>
-          <w:tblHeader w:val="false"/>
-        </w:trPr>
-        <w:tc>
-          <w:tcPr>
-            <w:tcW w:type="dxa" w:w="6225"/>
-            <w:tcBorders>
-              <w:top w:val="single" w:color="B8C8D8" w:sz="4"/>
-              <w:left w:val="single" w:color="B8C8D8" w:sz="4"/>
-              <w:bottom w:val="single" w:color="B8C8D8" w:sz="4"/>
-              <w:right w:val="single" w:color="B8C8D8" w:sz="4"/>
-            </w:tcBorders>
-            <w:tcMar>
-              <w:top w:type="dxa" w:w="60"/>
-              <w:left w:type="dxa" w:w="90"/>
-              <w:bottom w:type="dxa" w:w="60"/>
-              <w:right w:type="dxa" w:w="90"/>
-            </w:tcMar>
-          </w:tcPr>
-          <w:p>
-            <w:r>
-              <w:rPr>
-                <w:sz w:val="18"/>
-                <w:szCs w:val="18"/>
-              </w:rPr>
-              <w:t xml:space="preserve">Company keeps</w:t>
-            </w:r>
-          </w:p>
-        </w:tc>
-        <w:tc>
-          <w:tcPr>
-            <w:tcW w:type="dxa" w:w="1482"/>
-            <w:tcBorders>
-              <w:top w:val="single" w:color="B8C8D8" w:sz="4"/>
-              <w:left w:val="single" w:color="B8C8D8" w:sz="4"/>
-              <w:bottom w:val="single" w:color="B8C8D8" w:sz="4"/>
-              <w:right w:val="single" w:color="B8C8D8" w:sz="4"/>
-            </w:tcBorders>
-            <w:tcMar>
-              <w:top w:type="dxa" w:w="60"/>
-              <w:left w:type="dxa" w:w="90"/>
-              <w:bottom w:type="dxa" w:w="60"/>
-              <w:right w:type="dxa" w:w="90"/>
-            </w:tcMar>
-          </w:tcPr>
-          <w:p>
-            <w:r>
-              <w:rPr>
-                <w:sz w:val="18"/>
-                <w:szCs w:val="18"/>
-              </w:rPr>
-              <w:t xml:space="preserve">$1,245</w:t>
-            </w:r>
-          </w:p>
-        </w:tc>
-        <w:tc>
-          <w:tcPr>
-            <w:tcW w:type="dxa" w:w="2373"/>
-            <w:tcBorders>
-              <w:top w:val="single" w:color="B8C8D8" w:sz="4"/>
-              <w:left w:val="single" w:color="B8C8D8" w:sz="4"/>
-              <w:bottom w:val="single" w:color="B8C8D8" w:sz="4"/>
-              <w:right w:val="single" w:color="B8C8D8" w:sz="4"/>
-            </w:tcBorders>
-            <w:tcMar>
-              <w:top w:type="dxa" w:w="60"/>
-              <w:left w:type="dxa" w:w="90"/>
-              <w:bottom w:type="dxa" w:w="60"/>
-              <w:right w:type="dxa" w:w="90"/>
-            </w:tcMar>
-          </w:tcPr>
-          <w:p>
-            <w:r>
-              <w:rPr>
-                <w:sz w:val="18"/>
-                <w:szCs w:val="18"/>
-              </w:rPr>
-              <w:t xml:space="preserve">$888</w:t>
+            <w:tcW w:type="dxa" w:w="1221"/>
+            <w:tcBorders>
+              <w:top w:val="single" w:color="B8C8D8" w:sz="4"/>
+              <w:left w:val="single" w:color="B8C8D8" w:sz="4"/>
+              <w:bottom w:val="single" w:color="B8C8D8" w:sz="4"/>
+              <w:right w:val="single" w:color="B8C8D8" w:sz="4"/>
+            </w:tcBorders>
+            <w:tcMar>
+              <w:top w:type="dxa" w:w="60"/>
+              <w:left w:type="dxa" w:w="90"/>
+              <w:bottom w:type="dxa" w:w="60"/>
+              <w:right w:type="dxa" w:w="90"/>
+            </w:tcMar>
+          </w:tcPr>
+          <w:p>
+            <w:r>
+              <w:rPr>
+                <w:sz w:val="18"/>
+                <w:szCs w:val="18"/>
+              </w:rPr>
+              <w:t xml:space="preserve">10 units</w:t>
+            </w:r>
+          </w:p>
+        </w:tc>
+        <w:tc>
+          <w:tcPr>
+            <w:tcW w:type="dxa" w:w="2240"/>
+            <w:tcBorders>
+              <w:top w:val="single" w:color="B8C8D8" w:sz="4"/>
+              <w:left w:val="single" w:color="B8C8D8" w:sz="4"/>
+              <w:bottom w:val="single" w:color="B8C8D8" w:sz="4"/>
+              <w:right w:val="single" w:color="B8C8D8" w:sz="4"/>
+            </w:tcBorders>
+            <w:tcMar>
+              <w:top w:type="dxa" w:w="60"/>
+              <w:left w:type="dxa" w:w="90"/>
+              <w:bottom w:type="dxa" w:w="60"/>
+              <w:right w:type="dxa" w:w="90"/>
+            </w:tcMar>
+          </w:tcPr>
+          <w:p>
+            <w:r>
+              <w:rPr>
+                <w:sz w:val="18"/>
+                <w:szCs w:val="18"/>
+              </w:rPr>
+              <w:t xml:space="preserve">$2,388</w:t>
+            </w:r>
+          </w:p>
+        </w:tc>
+        <w:tc>
+          <w:tcPr>
+            <w:tcW w:type="dxa" w:w="2341"/>
+            <w:tcBorders>
+              <w:top w:val="single" w:color="B8C8D8" w:sz="4"/>
+              <w:left w:val="single" w:color="B8C8D8" w:sz="4"/>
+              <w:bottom w:val="single" w:color="B8C8D8" w:sz="4"/>
+              <w:right w:val="single" w:color="B8C8D8" w:sz="4"/>
+            </w:tcBorders>
+            <w:tcMar>
+              <w:top w:type="dxa" w:w="60"/>
+              <w:left w:type="dxa" w:w="90"/>
+              <w:bottom w:type="dxa" w:w="60"/>
+              <w:right w:type="dxa" w:w="90"/>
+            </w:tcMar>
+          </w:tcPr>
+          <w:p>
+            <w:r>
+              <w:rPr>
+                <w:sz w:val="18"/>
+                <w:szCs w:val="18"/>
+              </w:rPr>
+              <w:t xml:space="preserve">$187</w:t>
+            </w:r>
+          </w:p>
+        </w:tc>
+        <w:tc>
+          <w:tcPr>
+            <w:tcW w:type="dxa" w:w="2138"/>
+            <w:tcBorders>
+              <w:top w:val="single" w:color="B8C8D8" w:sz="4"/>
+              <w:left w:val="single" w:color="B8C8D8" w:sz="4"/>
+              <w:bottom w:val="single" w:color="B8C8D8" w:sz="4"/>
+              <w:right w:val="single" w:color="B8C8D8" w:sz="4"/>
+            </w:tcBorders>
+            <w:tcMar>
+              <w:top w:type="dxa" w:w="60"/>
+              <w:left w:type="dxa" w:w="90"/>
+              <w:bottom w:type="dxa" w:w="60"/>
+              <w:right w:type="dxa" w:w="90"/>
+            </w:tcMar>
+          </w:tcPr>
+          <w:p>
+            <w:r>
+              <w:rPr>
+                <w:sz w:val="18"/>
+                <w:szCs w:val="18"/>
+              </w:rPr>
+              <w:t xml:space="preserve">$149</w:t>
+            </w:r>
+          </w:p>
+        </w:tc>
+        <w:tc>
+          <w:tcPr>
+            <w:tcW w:type="dxa" w:w="2140"/>
+            <w:tcBorders>
+              <w:top w:val="single" w:color="B8C8D8" w:sz="4"/>
+              <w:left w:val="single" w:color="B8C8D8" w:sz="4"/>
+              <w:bottom w:val="single" w:color="B8C8D8" w:sz="4"/>
+              <w:right w:val="single" w:color="B8C8D8" w:sz="4"/>
+            </w:tcBorders>
+            <w:tcMar>
+              <w:top w:type="dxa" w:w="60"/>
+              <w:left w:type="dxa" w:w="90"/>
+              <w:bottom w:type="dxa" w:w="60"/>
+              <w:right w:type="dxa" w:w="90"/>
+            </w:tcMar>
+          </w:tcPr>
+          <w:p>
+            <w:r>
+              <w:rPr>
+                <w:sz w:val="18"/>
+                <w:szCs w:val="18"/>
+              </w:rPr>
+              <w:t xml:space="preserve">$14.90</w:t>
             </w:r>
           </w:p>
         </w:tc>
@@ -1944,6 +2413,7 @@
     </w:p>
     <w:p>
       <w:pPr>
+        <w:keepNext w:val="false"/>
         <w:spacing w:after="140"/>
       </w:pPr>
       <w:r>
@@ -1951,1124 +2421,15 @@
           <w:b/>
           <w:bCs/>
         </w:rPr>
-        <w:t xml:space="preserve">Rates</w:t>
+        <w:t xml:space="preserve">Example:</w:t>
+      </w:r>
+      <w:r>
+        <w:t xml:space="preserve"> a rep who signs 7 five-unit kitchens a month earns $819 in upfront commission that month. After a year at that pace, the rep has 84 paying customers and earns about $832 a month in residuals on top of new sales.</w:t>
       </w:r>
     </w:p>
     <w:p>
       <w:pPr>
-        <w:pStyle w:val="ListParagraph"/>
-        <w:numPr>
-          <w:ilvl w:val="0"/>
-          <w:numId w:val="2"/>
-        </w:numPr>
-        <w:spacing w:after="60"/>
-      </w:pPr>
-      <w:r>
-        <w:rPr>
-          <w:b/>
-          <w:bCs/>
-        </w:rPr>
-        <w:t xml:space="preserve">$20 per held visit:</w:t>
-      </w:r>
-      <w:r>
-        <w:t xml:space="preserve"> a visit that actually happens with the owner or manager present, confirmed by COOKd Kitchen. Visits that are booked but don't happen pay nothing.</w:t>
-      </w:r>
-    </w:p>
-    <w:p>
-      <w:pPr>
-        <w:pStyle w:val="ListParagraph"/>
-        <w:numPr>
-          <w:ilvl w:val="0"/>
-          <w:numId w:val="2"/>
-        </w:numPr>
-        <w:spacing w:after="60"/>
-      </w:pPr>
-      <w:r>
-        <w:rPr>
-          <w:b/>
-          <w:bCs/>
-        </w:rPr>
-        <w:t xml:space="preserve">7.5% of the upfront sale</w:t>
-      </w:r>
-      <w:r>
-        <w:t xml:space="preserve"> (equipment plus installation), paid once the customer's payment clears and the install is complete.</w:t>
-      </w:r>
-    </w:p>
-    <w:p>
-      <w:pPr>
-        <w:pStyle w:val="ListParagraph"/>
-        <w:numPr>
-          <w:ilvl w:val="0"/>
-          <w:numId w:val="2"/>
-        </w:numPr>
-        <w:spacing w:after="60"/>
-      </w:pPr>
-      <w:r>
-        <w:rPr>
-          <w:b/>
-          <w:bCs/>
-        </w:rPr>
-        <w:t xml:space="preserve">$25 bonus</w:t>
-      </w:r>
-      <w:r>
-        <w:t xml:space="preserve"> when the customer chooses the yearly plan.</w:t>
-      </w:r>
-    </w:p>
-    <w:p>
-      <w:pPr>
-        <w:pStyle w:val="ListParagraph"/>
-        <w:numPr>
-          <w:ilvl w:val="0"/>
-          <w:numId w:val="2"/>
-        </w:numPr>
-        <w:spacing w:after="60"/>
-      </w:pPr>
-      <w:r>
-        <w:rPr>
-          <w:b/>
-          <w:bCs/>
-        </w:rPr>
-        <w:t xml:space="preserve">No monthly residuals.</w:t>
-      </w:r>
-      <w:r>
-        <w:t xml:space="preserve"> Reps are paid for new business they bring in.</w:t>
-      </w:r>
-    </w:p>
-    <w:p>
-      <w:pPr>
-        <w:spacing w:after="140"/>
-      </w:pPr>
-      <w:r>
-        <w:rPr>
-          <w:b/>
-          <w:bCs/>
-        </w:rPr>
-        <w:t xml:space="preserve">What one deal pays</w:t>
-      </w:r>
-      <w:r>
-        <w:t xml:space="preserve"> (assumes about 3 held visits for every signed deal)</w:t>
-      </w:r>
-    </w:p>
-    <w:tbl>
-      <w:tblPr>
-        <w:tblW w:type="dxa" w:w="10080"/>
-        <w:tblBorders>
-          <w:top w:val="single" w:color="auto" w:sz="4"/>
-          <w:left w:val="single" w:color="auto" w:sz="4"/>
-          <w:bottom w:val="single" w:color="auto" w:sz="4"/>
-          <w:right w:val="single" w:color="auto" w:sz="4"/>
-          <w:insideH w:val="single" w:color="auto" w:sz="4"/>
-          <w:insideV w:val="single" w:color="auto" w:sz="4"/>
-        </w:tblBorders>
-      </w:tblPr>
-      <w:tblGrid>
-        <w:gridCol w:w="1440"/>
-        <w:gridCol w:w="1440"/>
-        <w:gridCol w:w="1440"/>
-        <w:gridCol w:w="1440"/>
-        <w:gridCol w:w="1440"/>
-        <w:gridCol w:w="1440"/>
-        <w:gridCol w:w="1440"/>
-      </w:tblGrid>
-      <w:tr>
-        <w:trPr>
-          <w:cantSplit/>
-          <w:tblHeader/>
-        </w:trPr>
-        <w:tc>
-          <w:tcPr>
-            <w:tcW w:type="dxa" w:w="1440"/>
-            <w:tcBorders>
-              <w:top w:val="single" w:color="B8C8D8" w:sz="4"/>
-              <w:left w:val="single" w:color="B8C8D8" w:sz="4"/>
-              <w:bottom w:val="single" w:color="B8C8D8" w:sz="4"/>
-              <w:right w:val="single" w:color="B8C8D8" w:sz="4"/>
-            </w:tcBorders>
-            <w:shd w:fill="DCEAF4" w:color="auto" w:val="clear"/>
-            <w:tcMar>
-              <w:top w:type="dxa" w:w="60"/>
-              <w:left w:type="dxa" w:w="90"/>
-              <w:bottom w:type="dxa" w:w="60"/>
-              <w:right w:type="dxa" w:w="90"/>
-            </w:tcMar>
-          </w:tcPr>
-          <w:p>
-            <w:r>
-              <w:rPr>
-                <w:b/>
-                <w:bCs/>
-                <w:color w:val="0B2A4A"/>
-                <w:sz w:val="18"/>
-                <w:szCs w:val="18"/>
-              </w:rPr>
-              <w:t xml:space="preserve">Kitchen size</w:t>
-            </w:r>
-          </w:p>
-        </w:tc>
-        <w:tc>
-          <w:tcPr>
-            <w:tcW w:type="dxa" w:w="1440"/>
-            <w:tcBorders>
-              <w:top w:val="single" w:color="B8C8D8" w:sz="4"/>
-              <w:left w:val="single" w:color="B8C8D8" w:sz="4"/>
-              <w:bottom w:val="single" w:color="B8C8D8" w:sz="4"/>
-              <w:right w:val="single" w:color="B8C8D8" w:sz="4"/>
-            </w:tcBorders>
-            <w:shd w:fill="DCEAF4" w:color="auto" w:val="clear"/>
-            <w:tcMar>
-              <w:top w:type="dxa" w:w="60"/>
-              <w:left w:type="dxa" w:w="90"/>
-              <w:bottom w:type="dxa" w:w="60"/>
-              <w:right w:type="dxa" w:w="90"/>
-            </w:tcMar>
-          </w:tcPr>
-          <w:p>
-            <w:r>
-              <w:rPr>
-                <w:b/>
-                <w:bCs/>
-                <w:color w:val="0B2A4A"/>
-                <w:sz w:val="18"/>
-                <w:szCs w:val="18"/>
-              </w:rPr>
-              <w:t xml:space="preserve">Upfront sale</w:t>
-            </w:r>
-          </w:p>
-        </w:tc>
-        <w:tc>
-          <w:tcPr>
-            <w:tcW w:type="dxa" w:w="1440"/>
-            <w:tcBorders>
-              <w:top w:val="single" w:color="B8C8D8" w:sz="4"/>
-              <w:left w:val="single" w:color="B8C8D8" w:sz="4"/>
-              <w:bottom w:val="single" w:color="B8C8D8" w:sz="4"/>
-              <w:right w:val="single" w:color="B8C8D8" w:sz="4"/>
-            </w:tcBorders>
-            <w:shd w:fill="DCEAF4" w:color="auto" w:val="clear"/>
-            <w:tcMar>
-              <w:top w:type="dxa" w:w="60"/>
-              <w:left w:type="dxa" w:w="90"/>
-              <w:bottom w:type="dxa" w:w="60"/>
-              <w:right w:type="dxa" w:w="90"/>
-            </w:tcMar>
-          </w:tcPr>
-          <w:p>
-            <w:r>
-              <w:rPr>
-                <w:b/>
-                <w:bCs/>
-                <w:color w:val="0B2A4A"/>
-                <w:sz w:val="18"/>
-                <w:szCs w:val="18"/>
-              </w:rPr>
-              <w:t xml:space="preserve">Company upfront profit</w:t>
-            </w:r>
-          </w:p>
-        </w:tc>
-        <w:tc>
-          <w:tcPr>
-            <w:tcW w:type="dxa" w:w="1440"/>
-            <w:tcBorders>
-              <w:top w:val="single" w:color="B8C8D8" w:sz="4"/>
-              <w:left w:val="single" w:color="B8C8D8" w:sz="4"/>
-              <w:bottom w:val="single" w:color="B8C8D8" w:sz="4"/>
-              <w:right w:val="single" w:color="B8C8D8" w:sz="4"/>
-            </w:tcBorders>
-            <w:shd w:fill="DCEAF4" w:color="auto" w:val="clear"/>
-            <w:tcMar>
-              <w:top w:type="dxa" w:w="60"/>
-              <w:left w:type="dxa" w:w="90"/>
-              <w:bottom w:type="dxa" w:w="60"/>
-              <w:right w:type="dxa" w:w="90"/>
-            </w:tcMar>
-          </w:tcPr>
-          <w:p>
-            <w:r>
-              <w:rPr>
-                <w:b/>
-                <w:bCs/>
-                <w:color w:val="0B2A4A"/>
-                <w:sz w:val="18"/>
-                <w:szCs w:val="18"/>
-              </w:rPr>
-              <w:t xml:space="preserve">Commission on sale</w:t>
-            </w:r>
-          </w:p>
-        </w:tc>
-        <w:tc>
-          <w:tcPr>
-            <w:tcW w:type="dxa" w:w="1440"/>
-            <w:tcBorders>
-              <w:top w:val="single" w:color="B8C8D8" w:sz="4"/>
-              <w:left w:val="single" w:color="B8C8D8" w:sz="4"/>
-              <w:bottom w:val="single" w:color="B8C8D8" w:sz="4"/>
-              <w:right w:val="single" w:color="B8C8D8" w:sz="4"/>
-            </w:tcBorders>
-            <w:shd w:fill="DCEAF4" w:color="auto" w:val="clear"/>
-            <w:tcMar>
-              <w:top w:type="dxa" w:w="60"/>
-              <w:left w:type="dxa" w:w="90"/>
-              <w:bottom w:type="dxa" w:w="60"/>
-              <w:right w:type="dxa" w:w="90"/>
-            </w:tcMar>
-          </w:tcPr>
-          <w:p>
-            <w:r>
-              <w:rPr>
-                <w:b/>
-                <w:bCs/>
-                <w:color w:val="0B2A4A"/>
-                <w:sz w:val="18"/>
-                <w:szCs w:val="18"/>
-              </w:rPr>
-              <w:t xml:space="preserve">Visit pay</w:t>
-            </w:r>
-          </w:p>
-        </w:tc>
-        <w:tc>
-          <w:tcPr>
-            <w:tcW w:type="dxa" w:w="1440"/>
-            <w:tcBorders>
-              <w:top w:val="single" w:color="B8C8D8" w:sz="4"/>
-              <w:left w:val="single" w:color="B8C8D8" w:sz="4"/>
-              <w:bottom w:val="single" w:color="B8C8D8" w:sz="4"/>
-              <w:right w:val="single" w:color="B8C8D8" w:sz="4"/>
-            </w:tcBorders>
-            <w:shd w:fill="DCEAF4" w:color="auto" w:val="clear"/>
-            <w:tcMar>
-              <w:top w:type="dxa" w:w="60"/>
-              <w:left w:type="dxa" w:w="90"/>
-              <w:bottom w:type="dxa" w:w="60"/>
-              <w:right w:type="dxa" w:w="90"/>
-            </w:tcMar>
-          </w:tcPr>
-          <w:p>
-            <w:r>
-              <w:rPr>
-                <w:b/>
-                <w:bCs/>
-                <w:color w:val="0B2A4A"/>
-                <w:sz w:val="18"/>
-                <w:szCs w:val="18"/>
-              </w:rPr>
-              <w:t xml:space="preserve">Rep total</w:t>
-            </w:r>
-          </w:p>
-        </w:tc>
-        <w:tc>
-          <w:tcPr>
-            <w:tcW w:type="dxa" w:w="1440"/>
-            <w:tcBorders>
-              <w:top w:val="single" w:color="B8C8D8" w:sz="4"/>
-              <w:left w:val="single" w:color="B8C8D8" w:sz="4"/>
-              <w:bottom w:val="single" w:color="B8C8D8" w:sz="4"/>
-              <w:right w:val="single" w:color="B8C8D8" w:sz="4"/>
-            </w:tcBorders>
-            <w:shd w:fill="DCEAF4" w:color="auto" w:val="clear"/>
-            <w:tcMar>
-              <w:top w:type="dxa" w:w="60"/>
-              <w:left w:type="dxa" w:w="90"/>
-              <w:bottom w:type="dxa" w:w="60"/>
-              <w:right w:type="dxa" w:w="90"/>
-            </w:tcMar>
-          </w:tcPr>
-          <w:p>
-            <w:r>
-              <w:rPr>
-                <w:b/>
-                <w:bCs/>
-                <w:color w:val="0B2A4A"/>
-                <w:sz w:val="18"/>
-                <w:szCs w:val="18"/>
-              </w:rPr>
-              <w:t xml:space="preserve">Rep share of upfront profit</w:t>
-            </w:r>
-          </w:p>
-        </w:tc>
-      </w:tr>
-      <w:tr>
-        <w:trPr>
-          <w:cantSplit/>
-          <w:tblHeader w:val="false"/>
-        </w:trPr>
-        <w:tc>
-          <w:tcPr>
-            <w:tcW w:type="dxa" w:w="1440"/>
-            <w:tcBorders>
-              <w:top w:val="single" w:color="B8C8D8" w:sz="4"/>
-              <w:left w:val="single" w:color="B8C8D8" w:sz="4"/>
-              <w:bottom w:val="single" w:color="B8C8D8" w:sz="4"/>
-              <w:right w:val="single" w:color="B8C8D8" w:sz="4"/>
-            </w:tcBorders>
-            <w:tcMar>
-              <w:top w:type="dxa" w:w="60"/>
-              <w:left w:type="dxa" w:w="90"/>
-              <w:bottom w:type="dxa" w:w="60"/>
-              <w:right w:type="dxa" w:w="90"/>
-            </w:tcMar>
-          </w:tcPr>
-          <w:p>
-            <w:r>
-              <w:rPr>
-                <w:sz w:val="18"/>
-                <w:szCs w:val="18"/>
-              </w:rPr>
-              <w:t xml:space="preserve">3 units</w:t>
-            </w:r>
-          </w:p>
-        </w:tc>
-        <w:tc>
-          <w:tcPr>
-            <w:tcW w:type="dxa" w:w="1440"/>
-            <w:tcBorders>
-              <w:top w:val="single" w:color="B8C8D8" w:sz="4"/>
-              <w:left w:val="single" w:color="B8C8D8" w:sz="4"/>
-              <w:bottom w:val="single" w:color="B8C8D8" w:sz="4"/>
-              <w:right w:val="single" w:color="B8C8D8" w:sz="4"/>
-            </w:tcBorders>
-            <w:tcMar>
-              <w:top w:type="dxa" w:w="60"/>
-              <w:left w:type="dxa" w:w="90"/>
-              <w:bottom w:type="dxa" w:w="60"/>
-              <w:right w:type="dxa" w:w="90"/>
-            </w:tcMar>
-          </w:tcPr>
-          <w:p>
-            <w:r>
-              <w:rPr>
-                <w:sz w:val="18"/>
-                <w:szCs w:val="18"/>
-              </w:rPr>
-              <w:t xml:space="preserve">$985</w:t>
-            </w:r>
-          </w:p>
-        </w:tc>
-        <w:tc>
-          <w:tcPr>
-            <w:tcW w:type="dxa" w:w="1440"/>
-            <w:tcBorders>
-              <w:top w:val="single" w:color="B8C8D8" w:sz="4"/>
-              <w:left w:val="single" w:color="B8C8D8" w:sz="4"/>
-              <w:bottom w:val="single" w:color="B8C8D8" w:sz="4"/>
-              <w:right w:val="single" w:color="B8C8D8" w:sz="4"/>
-            </w:tcBorders>
-            <w:tcMar>
-              <w:top w:type="dxa" w:w="60"/>
-              <w:left w:type="dxa" w:w="90"/>
-              <w:bottom w:type="dxa" w:w="60"/>
-              <w:right w:type="dxa" w:w="90"/>
-            </w:tcMar>
-          </w:tcPr>
-          <w:p>
-            <w:r>
-              <w:rPr>
-                <w:sz w:val="18"/>
-                <w:szCs w:val="18"/>
-              </w:rPr>
-              <w:t xml:space="preserve">$392</w:t>
-            </w:r>
-          </w:p>
-        </w:tc>
-        <w:tc>
-          <w:tcPr>
-            <w:tcW w:type="dxa" w:w="1440"/>
-            <w:tcBorders>
-              <w:top w:val="single" w:color="B8C8D8" w:sz="4"/>
-              <w:left w:val="single" w:color="B8C8D8" w:sz="4"/>
-              <w:bottom w:val="single" w:color="B8C8D8" w:sz="4"/>
-              <w:right w:val="single" w:color="B8C8D8" w:sz="4"/>
-            </w:tcBorders>
-            <w:tcMar>
-              <w:top w:type="dxa" w:w="60"/>
-              <w:left w:type="dxa" w:w="90"/>
-              <w:bottom w:type="dxa" w:w="60"/>
-              <w:right w:type="dxa" w:w="90"/>
-            </w:tcMar>
-          </w:tcPr>
-          <w:p>
-            <w:r>
-              <w:rPr>
-                <w:sz w:val="18"/>
-                <w:szCs w:val="18"/>
-              </w:rPr>
-              <w:t xml:space="preserve">$74</w:t>
-            </w:r>
-          </w:p>
-        </w:tc>
-        <w:tc>
-          <w:tcPr>
-            <w:tcW w:type="dxa" w:w="1440"/>
-            <w:tcBorders>
-              <w:top w:val="single" w:color="B8C8D8" w:sz="4"/>
-              <w:left w:val="single" w:color="B8C8D8" w:sz="4"/>
-              <w:bottom w:val="single" w:color="B8C8D8" w:sz="4"/>
-              <w:right w:val="single" w:color="B8C8D8" w:sz="4"/>
-            </w:tcBorders>
-            <w:tcMar>
-              <w:top w:type="dxa" w:w="60"/>
-              <w:left w:type="dxa" w:w="90"/>
-              <w:bottom w:type="dxa" w:w="60"/>
-              <w:right w:type="dxa" w:w="90"/>
-            </w:tcMar>
-          </w:tcPr>
-          <w:p>
-            <w:r>
-              <w:rPr>
-                <w:sz w:val="18"/>
-                <w:szCs w:val="18"/>
-              </w:rPr>
-              <w:t xml:space="preserve">$60</w:t>
-            </w:r>
-          </w:p>
-        </w:tc>
-        <w:tc>
-          <w:tcPr>
-            <w:tcW w:type="dxa" w:w="1440"/>
-            <w:tcBorders>
-              <w:top w:val="single" w:color="B8C8D8" w:sz="4"/>
-              <w:left w:val="single" w:color="B8C8D8" w:sz="4"/>
-              <w:bottom w:val="single" w:color="B8C8D8" w:sz="4"/>
-              <w:right w:val="single" w:color="B8C8D8" w:sz="4"/>
-            </w:tcBorders>
-            <w:tcMar>
-              <w:top w:type="dxa" w:w="60"/>
-              <w:left w:type="dxa" w:w="90"/>
-              <w:bottom w:type="dxa" w:w="60"/>
-              <w:right w:type="dxa" w:w="90"/>
-            </w:tcMar>
-          </w:tcPr>
-          <w:p>
-            <w:r>
-              <w:rPr>
-                <w:sz w:val="18"/>
-                <w:szCs w:val="18"/>
-              </w:rPr>
-              <w:t xml:space="preserve">$134</w:t>
-            </w:r>
-          </w:p>
-        </w:tc>
-        <w:tc>
-          <w:tcPr>
-            <w:tcW w:type="dxa" w:w="1440"/>
-            <w:tcBorders>
-              <w:top w:val="single" w:color="B8C8D8" w:sz="4"/>
-              <w:left w:val="single" w:color="B8C8D8" w:sz="4"/>
-              <w:bottom w:val="single" w:color="B8C8D8" w:sz="4"/>
-              <w:right w:val="single" w:color="B8C8D8" w:sz="4"/>
-            </w:tcBorders>
-            <w:tcMar>
-              <w:top w:type="dxa" w:w="60"/>
-              <w:left w:type="dxa" w:w="90"/>
-              <w:bottom w:type="dxa" w:w="60"/>
-              <w:right w:type="dxa" w:w="90"/>
-            </w:tcMar>
-          </w:tcPr>
-          <w:p>
-            <w:r>
-              <w:rPr>
-                <w:sz w:val="18"/>
-                <w:szCs w:val="18"/>
-              </w:rPr>
-              <w:t xml:space="preserve">34%</w:t>
-            </w:r>
-          </w:p>
-        </w:tc>
-      </w:tr>
-      <w:tr>
-        <w:trPr>
-          <w:cantSplit/>
-          <w:tblHeader w:val="false"/>
-        </w:trPr>
-        <w:tc>
-          <w:tcPr>
-            <w:tcW w:type="dxa" w:w="1440"/>
-            <w:tcBorders>
-              <w:top w:val="single" w:color="B8C8D8" w:sz="4"/>
-              <w:left w:val="single" w:color="B8C8D8" w:sz="4"/>
-              <w:bottom w:val="single" w:color="B8C8D8" w:sz="4"/>
-              <w:right w:val="single" w:color="B8C8D8" w:sz="4"/>
-            </w:tcBorders>
-            <w:tcMar>
-              <w:top w:type="dxa" w:w="60"/>
-              <w:left w:type="dxa" w:w="90"/>
-              <w:bottom w:type="dxa" w:w="60"/>
-              <w:right w:type="dxa" w:w="90"/>
-            </w:tcMar>
-          </w:tcPr>
-          <w:p>
-            <w:r>
-              <w:rPr>
-                <w:sz w:val="18"/>
-                <w:szCs w:val="18"/>
-              </w:rPr>
-              <w:t xml:space="preserve">5 units</w:t>
-            </w:r>
-          </w:p>
-        </w:tc>
-        <w:tc>
-          <w:tcPr>
-            <w:tcW w:type="dxa" w:w="1440"/>
-            <w:tcBorders>
-              <w:top w:val="single" w:color="B8C8D8" w:sz="4"/>
-              <w:left w:val="single" w:color="B8C8D8" w:sz="4"/>
-              <w:bottom w:val="single" w:color="B8C8D8" w:sz="4"/>
-              <w:right w:val="single" w:color="B8C8D8" w:sz="4"/>
-            </w:tcBorders>
-            <w:tcMar>
-              <w:top w:type="dxa" w:w="60"/>
-              <w:left w:type="dxa" w:w="90"/>
-              <w:bottom w:type="dxa" w:w="60"/>
-              <w:right w:type="dxa" w:w="90"/>
-            </w:tcMar>
-          </w:tcPr>
-          <w:p>
-            <w:r>
-              <w:rPr>
-                <w:sz w:val="18"/>
-                <w:szCs w:val="18"/>
-              </w:rPr>
-              <w:t xml:space="preserve">$1,343</w:t>
-            </w:r>
-          </w:p>
-        </w:tc>
-        <w:tc>
-          <w:tcPr>
-            <w:tcW w:type="dxa" w:w="1440"/>
-            <w:tcBorders>
-              <w:top w:val="single" w:color="B8C8D8" w:sz="4"/>
-              <w:left w:val="single" w:color="B8C8D8" w:sz="4"/>
-              <w:bottom w:val="single" w:color="B8C8D8" w:sz="4"/>
-              <w:right w:val="single" w:color="B8C8D8" w:sz="4"/>
-            </w:tcBorders>
-            <w:tcMar>
-              <w:top w:type="dxa" w:w="60"/>
-              <w:left w:type="dxa" w:w="90"/>
-              <w:bottom w:type="dxa" w:w="60"/>
-              <w:right w:type="dxa" w:w="90"/>
-            </w:tcMar>
-          </w:tcPr>
-          <w:p>
-            <w:r>
-              <w:rPr>
-                <w:sz w:val="18"/>
-                <w:szCs w:val="18"/>
-              </w:rPr>
-              <w:t xml:space="preserve">$518</w:t>
-            </w:r>
-          </w:p>
-        </w:tc>
-        <w:tc>
-          <w:tcPr>
-            <w:tcW w:type="dxa" w:w="1440"/>
-            <w:tcBorders>
-              <w:top w:val="single" w:color="B8C8D8" w:sz="4"/>
-              <w:left w:val="single" w:color="B8C8D8" w:sz="4"/>
-              <w:bottom w:val="single" w:color="B8C8D8" w:sz="4"/>
-              <w:right w:val="single" w:color="B8C8D8" w:sz="4"/>
-            </w:tcBorders>
-            <w:tcMar>
-              <w:top w:type="dxa" w:w="60"/>
-              <w:left w:type="dxa" w:w="90"/>
-              <w:bottom w:type="dxa" w:w="60"/>
-              <w:right w:type="dxa" w:w="90"/>
-            </w:tcMar>
-          </w:tcPr>
-          <w:p>
-            <w:r>
-              <w:rPr>
-                <w:sz w:val="18"/>
-                <w:szCs w:val="18"/>
-              </w:rPr>
-              <w:t xml:space="preserve">$101</w:t>
-            </w:r>
-          </w:p>
-        </w:tc>
-        <w:tc>
-          <w:tcPr>
-            <w:tcW w:type="dxa" w:w="1440"/>
-            <w:tcBorders>
-              <w:top w:val="single" w:color="B8C8D8" w:sz="4"/>
-              <w:left w:val="single" w:color="B8C8D8" w:sz="4"/>
-              <w:bottom w:val="single" w:color="B8C8D8" w:sz="4"/>
-              <w:right w:val="single" w:color="B8C8D8" w:sz="4"/>
-            </w:tcBorders>
-            <w:tcMar>
-              <w:top w:type="dxa" w:w="60"/>
-              <w:left w:type="dxa" w:w="90"/>
-              <w:bottom w:type="dxa" w:w="60"/>
-              <w:right w:type="dxa" w:w="90"/>
-            </w:tcMar>
-          </w:tcPr>
-          <w:p>
-            <w:r>
-              <w:rPr>
-                <w:sz w:val="18"/>
-                <w:szCs w:val="18"/>
-              </w:rPr>
-              <w:t xml:space="preserve">$60</w:t>
-            </w:r>
-          </w:p>
-        </w:tc>
-        <w:tc>
-          <w:tcPr>
-            <w:tcW w:type="dxa" w:w="1440"/>
-            <w:tcBorders>
-              <w:top w:val="single" w:color="B8C8D8" w:sz="4"/>
-              <w:left w:val="single" w:color="B8C8D8" w:sz="4"/>
-              <w:bottom w:val="single" w:color="B8C8D8" w:sz="4"/>
-              <w:right w:val="single" w:color="B8C8D8" w:sz="4"/>
-            </w:tcBorders>
-            <w:tcMar>
-              <w:top w:type="dxa" w:w="60"/>
-              <w:left w:type="dxa" w:w="90"/>
-              <w:bottom w:type="dxa" w:w="60"/>
-              <w:right w:type="dxa" w:w="90"/>
-            </w:tcMar>
-          </w:tcPr>
-          <w:p>
-            <w:r>
-              <w:rPr>
-                <w:sz w:val="18"/>
-                <w:szCs w:val="18"/>
-              </w:rPr>
-              <w:t xml:space="preserve">$161</w:t>
-            </w:r>
-          </w:p>
-        </w:tc>
-        <w:tc>
-          <w:tcPr>
-            <w:tcW w:type="dxa" w:w="1440"/>
-            <w:tcBorders>
-              <w:top w:val="single" w:color="B8C8D8" w:sz="4"/>
-              <w:left w:val="single" w:color="B8C8D8" w:sz="4"/>
-              <w:bottom w:val="single" w:color="B8C8D8" w:sz="4"/>
-              <w:right w:val="single" w:color="B8C8D8" w:sz="4"/>
-            </w:tcBorders>
-            <w:tcMar>
-              <w:top w:type="dxa" w:w="60"/>
-              <w:left w:type="dxa" w:w="90"/>
-              <w:bottom w:type="dxa" w:w="60"/>
-              <w:right w:type="dxa" w:w="90"/>
-            </w:tcMar>
-          </w:tcPr>
-          <w:p>
-            <w:r>
-              <w:rPr>
-                <w:sz w:val="18"/>
-                <w:szCs w:val="18"/>
-              </w:rPr>
-              <w:t xml:space="preserve">31%</w:t>
-            </w:r>
-          </w:p>
-        </w:tc>
-      </w:tr>
-      <w:tr>
-        <w:trPr>
-          <w:cantSplit/>
-          <w:tblHeader w:val="false"/>
-        </w:trPr>
-        <w:tc>
-          <w:tcPr>
-            <w:tcW w:type="dxa" w:w="1440"/>
-            <w:tcBorders>
-              <w:top w:val="single" w:color="B8C8D8" w:sz="4"/>
-              <w:left w:val="single" w:color="B8C8D8" w:sz="4"/>
-              <w:bottom w:val="single" w:color="B8C8D8" w:sz="4"/>
-              <w:right w:val="single" w:color="B8C8D8" w:sz="4"/>
-            </w:tcBorders>
-            <w:tcMar>
-              <w:top w:type="dxa" w:w="60"/>
-              <w:left w:type="dxa" w:w="90"/>
-              <w:bottom w:type="dxa" w:w="60"/>
-              <w:right w:type="dxa" w:w="90"/>
-            </w:tcMar>
-          </w:tcPr>
-          <w:p>
-            <w:r>
-              <w:rPr>
-                <w:sz w:val="18"/>
-                <w:szCs w:val="18"/>
-              </w:rPr>
-              <w:t xml:space="preserve">8 units</w:t>
-            </w:r>
-          </w:p>
-        </w:tc>
-        <w:tc>
-          <w:tcPr>
-            <w:tcW w:type="dxa" w:w="1440"/>
-            <w:tcBorders>
-              <w:top w:val="single" w:color="B8C8D8" w:sz="4"/>
-              <w:left w:val="single" w:color="B8C8D8" w:sz="4"/>
-              <w:bottom w:val="single" w:color="B8C8D8" w:sz="4"/>
-              <w:right w:val="single" w:color="B8C8D8" w:sz="4"/>
-            </w:tcBorders>
-            <w:tcMar>
-              <w:top w:type="dxa" w:w="60"/>
-              <w:left w:type="dxa" w:w="90"/>
-              <w:bottom w:type="dxa" w:w="60"/>
-              <w:right w:type="dxa" w:w="90"/>
-            </w:tcMar>
-          </w:tcPr>
-          <w:p>
-            <w:r>
-              <w:rPr>
-                <w:sz w:val="18"/>
-                <w:szCs w:val="18"/>
-              </w:rPr>
-              <w:t xml:space="preserve">$1,880</w:t>
-            </w:r>
-          </w:p>
-        </w:tc>
-        <w:tc>
-          <w:tcPr>
-            <w:tcW w:type="dxa" w:w="1440"/>
-            <w:tcBorders>
-              <w:top w:val="single" w:color="B8C8D8" w:sz="4"/>
-              <w:left w:val="single" w:color="B8C8D8" w:sz="4"/>
-              <w:bottom w:val="single" w:color="B8C8D8" w:sz="4"/>
-              <w:right w:val="single" w:color="B8C8D8" w:sz="4"/>
-            </w:tcBorders>
-            <w:tcMar>
-              <w:top w:type="dxa" w:w="60"/>
-              <w:left w:type="dxa" w:w="90"/>
-              <w:bottom w:type="dxa" w:w="60"/>
-              <w:right w:type="dxa" w:w="90"/>
-            </w:tcMar>
-          </w:tcPr>
-          <w:p>
-            <w:r>
-              <w:rPr>
-                <w:sz w:val="18"/>
-                <w:szCs w:val="18"/>
-              </w:rPr>
-              <w:t xml:space="preserve">$707</w:t>
-            </w:r>
-          </w:p>
-        </w:tc>
-        <w:tc>
-          <w:tcPr>
-            <w:tcW w:type="dxa" w:w="1440"/>
-            <w:tcBorders>
-              <w:top w:val="single" w:color="B8C8D8" w:sz="4"/>
-              <w:left w:val="single" w:color="B8C8D8" w:sz="4"/>
-              <w:bottom w:val="single" w:color="B8C8D8" w:sz="4"/>
-              <w:right w:val="single" w:color="B8C8D8" w:sz="4"/>
-            </w:tcBorders>
-            <w:tcMar>
-              <w:top w:type="dxa" w:w="60"/>
-              <w:left w:type="dxa" w:w="90"/>
-              <w:bottom w:type="dxa" w:w="60"/>
-              <w:right w:type="dxa" w:w="90"/>
-            </w:tcMar>
-          </w:tcPr>
-          <w:p>
-            <w:r>
-              <w:rPr>
-                <w:sz w:val="18"/>
-                <w:szCs w:val="18"/>
-              </w:rPr>
-              <w:t xml:space="preserve">$141</w:t>
-            </w:r>
-          </w:p>
-        </w:tc>
-        <w:tc>
-          <w:tcPr>
-            <w:tcW w:type="dxa" w:w="1440"/>
-            <w:tcBorders>
-              <w:top w:val="single" w:color="B8C8D8" w:sz="4"/>
-              <w:left w:val="single" w:color="B8C8D8" w:sz="4"/>
-              <w:bottom w:val="single" w:color="B8C8D8" w:sz="4"/>
-              <w:right w:val="single" w:color="B8C8D8" w:sz="4"/>
-            </w:tcBorders>
-            <w:tcMar>
-              <w:top w:type="dxa" w:w="60"/>
-              <w:left w:type="dxa" w:w="90"/>
-              <w:bottom w:type="dxa" w:w="60"/>
-              <w:right w:type="dxa" w:w="90"/>
-            </w:tcMar>
-          </w:tcPr>
-          <w:p>
-            <w:r>
-              <w:rPr>
-                <w:sz w:val="18"/>
-                <w:szCs w:val="18"/>
-              </w:rPr>
-              <w:t xml:space="preserve">$60</w:t>
-            </w:r>
-          </w:p>
-        </w:tc>
-        <w:tc>
-          <w:tcPr>
-            <w:tcW w:type="dxa" w:w="1440"/>
-            <w:tcBorders>
-              <w:top w:val="single" w:color="B8C8D8" w:sz="4"/>
-              <w:left w:val="single" w:color="B8C8D8" w:sz="4"/>
-              <w:bottom w:val="single" w:color="B8C8D8" w:sz="4"/>
-              <w:right w:val="single" w:color="B8C8D8" w:sz="4"/>
-            </w:tcBorders>
-            <w:tcMar>
-              <w:top w:type="dxa" w:w="60"/>
-              <w:left w:type="dxa" w:w="90"/>
-              <w:bottom w:type="dxa" w:w="60"/>
-              <w:right w:type="dxa" w:w="90"/>
-            </w:tcMar>
-          </w:tcPr>
-          <w:p>
-            <w:r>
-              <w:rPr>
-                <w:sz w:val="18"/>
-                <w:szCs w:val="18"/>
-              </w:rPr>
-              <w:t xml:space="preserve">$201</w:t>
-            </w:r>
-          </w:p>
-        </w:tc>
-        <w:tc>
-          <w:tcPr>
-            <w:tcW w:type="dxa" w:w="1440"/>
-            <w:tcBorders>
-              <w:top w:val="single" w:color="B8C8D8" w:sz="4"/>
-              <w:left w:val="single" w:color="B8C8D8" w:sz="4"/>
-              <w:bottom w:val="single" w:color="B8C8D8" w:sz="4"/>
-              <w:right w:val="single" w:color="B8C8D8" w:sz="4"/>
-            </w:tcBorders>
-            <w:tcMar>
-              <w:top w:type="dxa" w:w="60"/>
-              <w:left w:type="dxa" w:w="90"/>
-              <w:bottom w:type="dxa" w:w="60"/>
-              <w:right w:type="dxa" w:w="90"/>
-            </w:tcMar>
-          </w:tcPr>
-          <w:p>
-            <w:r>
-              <w:rPr>
-                <w:sz w:val="18"/>
-                <w:szCs w:val="18"/>
-              </w:rPr>
-              <w:t xml:space="preserve">28%</w:t>
-            </w:r>
-          </w:p>
-        </w:tc>
-      </w:tr>
-      <w:tr>
-        <w:trPr>
-          <w:cantSplit/>
-          <w:tblHeader w:val="false"/>
-        </w:trPr>
-        <w:tc>
-          <w:tcPr>
-            <w:tcW w:type="dxa" w:w="1440"/>
-            <w:tcBorders>
-              <w:top w:val="single" w:color="B8C8D8" w:sz="4"/>
-              <w:left w:val="single" w:color="B8C8D8" w:sz="4"/>
-              <w:bottom w:val="single" w:color="B8C8D8" w:sz="4"/>
-              <w:right w:val="single" w:color="B8C8D8" w:sz="4"/>
-            </w:tcBorders>
-            <w:tcMar>
-              <w:top w:type="dxa" w:w="60"/>
-              <w:left w:type="dxa" w:w="90"/>
-              <w:bottom w:type="dxa" w:w="60"/>
-              <w:right w:type="dxa" w:w="90"/>
-            </w:tcMar>
-          </w:tcPr>
-          <w:p>
-            <w:r>
-              <w:rPr>
-                <w:sz w:val="18"/>
-                <w:szCs w:val="18"/>
-              </w:rPr>
-              <w:t xml:space="preserve">10 units</w:t>
-            </w:r>
-          </w:p>
-        </w:tc>
-        <w:tc>
-          <w:tcPr>
-            <w:tcW w:type="dxa" w:w="1440"/>
-            <w:tcBorders>
-              <w:top w:val="single" w:color="B8C8D8" w:sz="4"/>
-              <w:left w:val="single" w:color="B8C8D8" w:sz="4"/>
-              <w:bottom w:val="single" w:color="B8C8D8" w:sz="4"/>
-              <w:right w:val="single" w:color="B8C8D8" w:sz="4"/>
-            </w:tcBorders>
-            <w:tcMar>
-              <w:top w:type="dxa" w:w="60"/>
-              <w:left w:type="dxa" w:w="90"/>
-              <w:bottom w:type="dxa" w:w="60"/>
-              <w:right w:type="dxa" w:w="90"/>
-            </w:tcMar>
-          </w:tcPr>
-          <w:p>
-            <w:r>
-              <w:rPr>
-                <w:sz w:val="18"/>
-                <w:szCs w:val="18"/>
-              </w:rPr>
-              <w:t xml:space="preserve">$2,238</w:t>
-            </w:r>
-          </w:p>
-        </w:tc>
-        <w:tc>
-          <w:tcPr>
-            <w:tcW w:type="dxa" w:w="1440"/>
-            <w:tcBorders>
-              <w:top w:val="single" w:color="B8C8D8" w:sz="4"/>
-              <w:left w:val="single" w:color="B8C8D8" w:sz="4"/>
-              <w:bottom w:val="single" w:color="B8C8D8" w:sz="4"/>
-              <w:right w:val="single" w:color="B8C8D8" w:sz="4"/>
-            </w:tcBorders>
-            <w:tcMar>
-              <w:top w:type="dxa" w:w="60"/>
-              <w:left w:type="dxa" w:w="90"/>
-              <w:bottom w:type="dxa" w:w="60"/>
-              <w:right w:type="dxa" w:w="90"/>
-            </w:tcMar>
-          </w:tcPr>
-          <w:p>
-            <w:r>
-              <w:rPr>
-                <w:sz w:val="18"/>
-                <w:szCs w:val="18"/>
-              </w:rPr>
-              <w:t xml:space="preserve">$833</w:t>
-            </w:r>
-          </w:p>
-        </w:tc>
-        <w:tc>
-          <w:tcPr>
-            <w:tcW w:type="dxa" w:w="1440"/>
-            <w:tcBorders>
-              <w:top w:val="single" w:color="B8C8D8" w:sz="4"/>
-              <w:left w:val="single" w:color="B8C8D8" w:sz="4"/>
-              <w:bottom w:val="single" w:color="B8C8D8" w:sz="4"/>
-              <w:right w:val="single" w:color="B8C8D8" w:sz="4"/>
-            </w:tcBorders>
-            <w:tcMar>
-              <w:top w:type="dxa" w:w="60"/>
-              <w:left w:type="dxa" w:w="90"/>
-              <w:bottom w:type="dxa" w:w="60"/>
-              <w:right w:type="dxa" w:w="90"/>
-            </w:tcMar>
-          </w:tcPr>
-          <w:p>
-            <w:r>
-              <w:rPr>
-                <w:sz w:val="18"/>
-                <w:szCs w:val="18"/>
-              </w:rPr>
-              <w:t xml:space="preserve">$168</w:t>
-            </w:r>
-          </w:p>
-        </w:tc>
-        <w:tc>
-          <w:tcPr>
-            <w:tcW w:type="dxa" w:w="1440"/>
-            <w:tcBorders>
-              <w:top w:val="single" w:color="B8C8D8" w:sz="4"/>
-              <w:left w:val="single" w:color="B8C8D8" w:sz="4"/>
-              <w:bottom w:val="single" w:color="B8C8D8" w:sz="4"/>
-              <w:right w:val="single" w:color="B8C8D8" w:sz="4"/>
-            </w:tcBorders>
-            <w:tcMar>
-              <w:top w:type="dxa" w:w="60"/>
-              <w:left w:type="dxa" w:w="90"/>
-              <w:bottom w:type="dxa" w:w="60"/>
-              <w:right w:type="dxa" w:w="90"/>
-            </w:tcMar>
-          </w:tcPr>
-          <w:p>
-            <w:r>
-              <w:rPr>
-                <w:sz w:val="18"/>
-                <w:szCs w:val="18"/>
-              </w:rPr>
-              <w:t xml:space="preserve">$60</w:t>
-            </w:r>
-          </w:p>
-        </w:tc>
-        <w:tc>
-          <w:tcPr>
-            <w:tcW w:type="dxa" w:w="1440"/>
-            <w:tcBorders>
-              <w:top w:val="single" w:color="B8C8D8" w:sz="4"/>
-              <w:left w:val="single" w:color="B8C8D8" w:sz="4"/>
-              <w:bottom w:val="single" w:color="B8C8D8" w:sz="4"/>
-              <w:right w:val="single" w:color="B8C8D8" w:sz="4"/>
-            </w:tcBorders>
-            <w:tcMar>
-              <w:top w:type="dxa" w:w="60"/>
-              <w:left w:type="dxa" w:w="90"/>
-              <w:bottom w:type="dxa" w:w="60"/>
-              <w:right w:type="dxa" w:w="90"/>
-            </w:tcMar>
-          </w:tcPr>
-          <w:p>
-            <w:r>
-              <w:rPr>
-                <w:sz w:val="18"/>
-                <w:szCs w:val="18"/>
-              </w:rPr>
-              <w:t xml:space="preserve">$228</w:t>
-            </w:r>
-          </w:p>
-        </w:tc>
-        <w:tc>
-          <w:tcPr>
-            <w:tcW w:type="dxa" w:w="1440"/>
-            <w:tcBorders>
-              <w:top w:val="single" w:color="B8C8D8" w:sz="4"/>
-              <w:left w:val="single" w:color="B8C8D8" w:sz="4"/>
-              <w:bottom w:val="single" w:color="B8C8D8" w:sz="4"/>
-              <w:right w:val="single" w:color="B8C8D8" w:sz="4"/>
-            </w:tcBorders>
-            <w:tcMar>
-              <w:top w:type="dxa" w:w="60"/>
-              <w:left w:type="dxa" w:w="90"/>
-              <w:bottom w:type="dxa" w:w="60"/>
-              <w:right w:type="dxa" w:w="90"/>
-            </w:tcMar>
-          </w:tcPr>
-          <w:p>
-            <w:r>
-              <w:rPr>
-                <w:sz w:val="18"/>
-                <w:szCs w:val="18"/>
-              </w:rPr>
-              <w:t xml:space="preserve">27%</w:t>
-            </w:r>
-          </w:p>
-        </w:tc>
-      </w:tr>
-    </w:tbl>
-    <w:p>
-      <w:pPr>
-        <w:spacing w:after="120"/>
-      </w:pPr>
-    </w:p>
-    <w:p>
-      <w:pPr>
-        <w:spacing w:after="140"/>
-      </w:pPr>
-      <w:r>
-        <w:t xml:space="preserve">The rep never earns more than about a third of the company's upfront profit on a deal, and the company keeps all monitoring profit, about $74 a month per 5-unit kitchen.</w:t>
-      </w:r>
-    </w:p>
-    <w:p>
-      <w:pPr>
-        <w:spacing w:after="140"/>
-      </w:pPr>
-      <w:r>
-        <w:rPr>
-          <w:b/>
-          <w:bCs/>
-        </w:rPr>
-        <w:t xml:space="preserve">Example month:</w:t>
-      </w:r>
-      <w:r>
-        <w:t xml:space="preserve"> a rep books 21 held visits and signs 7 five-unit kitchens. The rep earns $1,127. The company keeps $2,499 from those installs, and its monthly monitoring profit grows by $518, every month after.</w:t>
-      </w:r>
-    </w:p>
-    <w:p>
-      <w:pPr>
+        <w:keepNext/>
         <w:spacing w:after="140"/>
       </w:pPr>
       <w:r>
@@ -3089,7 +2450,7 @@
         <w:spacing w:after="60"/>
       </w:pPr>
       <w:r>
-        <w:t xml:space="preserve">Visit pay is earned only for visits held with an owner or manager, confirmed by COOKd Kitchen.</w:t>
+        <w:t xml:space="preserve">Commission is earned only on paid sales: after the customer's full payment clears and their sensors come online. Nothing is paid for calls or appointments.</w:t>
       </w:r>
     </w:p>
     <w:p>
@@ -3102,7 +2463,7 @@
         <w:spacing w:after="60"/>
       </w:pPr>
       <w:r>
-        <w:t xml:space="preserve">Sale commission is paid only after the customer's payment clears and the install is complete, never on a verbal yes or a signed form alone.</w:t>
+        <w:t xml:space="preserve">Upfront commission is paid after a 14-day hold, so refunds and card chargebacks never come out of company funds.</w:t>
       </w:r>
     </w:p>
     <w:p>
@@ -3141,7 +2502,7 @@
         <w:spacing w:after="60"/>
       </w:pPr>
       <w:r>
-        <w:t xml:space="preserve">Commission rates can change with 30 days written notice.</w:t>
+        <w:t xml:space="preserve">Residuals continue while the customer pays and the rep closes at least one new customer every 90 days. They end 3 months after the rep stops working with COOKd Kitchen. Rates for new sales can change with 30 days written notice.</w:t>
       </w:r>
     </w:p>
     <w:p>
@@ -3178,10 +2539,11 @@
     </w:p>
     <w:p>
       <w:pPr>
+        <w:keepNext/>
         <w:spacing w:after="140"/>
       </w:pPr>
       <w:r>
-        <w:t xml:space="preserve">Start with these 30 local restaurants, calling the 24-hour, high-volume, and multi-location kitchens at the top first. Write the result of every call in the Status column: Left voicemail, Call back, Visit booked, Not interested, or Signed.</w:t>
+        <w:t xml:space="preserve">Start with these 30 local restaurants, calling the 24-hour, high-volume, and multi-location kitchens at the top first. Write the result of every call in the Status column: Left voicemail, Call back, Quote sent, Not interested, or Signed.</w:t>
       </w:r>
     </w:p>
     <w:tbl>
@@ -8829,6 +8191,7 @@
     </w:p>
     <w:p>
       <w:pPr>
+        <w:keepNext w:val="false"/>
         <w:spacing w:after="140"/>
       </w:pPr>
       <w:r>
@@ -8844,6 +8207,7 @@
     </w:p>
     <w:p>
       <w:pPr>
+        <w:keepNext w:val="false"/>
         <w:spacing w:after="140"/>
       </w:pPr>
       <w:r>

</xml_diff>